<commit_message>
release: v1.0.2 align architecture books and add bilingual framework presentations
</commit_message>
<xml_diff>
--- a/docs/book/Waaxalma_Architecture_Vision_Book_v0.4_EN.docx
+++ b/docs/book/Waaxalma_Architecture_Vision_Book_v0.4_EN.docx
@@ -3,73 +3,41 @@
 <w:document xmlns:wpc="http://schemas.microsoft.com/office/word/2010/wordprocessingCanvas" xmlns:mo="http://schemas.microsoft.com/office/mac/office/2008/main" xmlns:mc="http://schemas.openxmlformats.org/markup-compatibility/2006" xmlns:mv="urn:schemas-microsoft-com:mac:vml" xmlns:o="urn:schemas-microsoft-com:office:office" xmlns:r="http://schemas.openxmlformats.org/officeDocument/2006/relationships" xmlns:m="http://schemas.openxmlformats.org/officeDocument/2006/math" xmlns:v="urn:schemas-microsoft-com:vml" xmlns:wp14="http://schemas.microsoft.com/office/word/2010/wordprocessingDrawing" xmlns:wp="http://schemas.openxmlformats.org/drawingml/2006/wordprocessingDrawing" xmlns:w10="urn:schemas-microsoft-com:office:word" xmlns:w="http://schemas.openxmlformats.org/wordprocessingml/2006/main" xmlns:w14="http://schemas.microsoft.com/office/word/2010/wordml" xmlns:wpg="http://schemas.microsoft.com/office/word/2010/wordprocessingGroup" xmlns:wpi="http://schemas.microsoft.com/office/word/2010/wordprocessingInk" xmlns:wne="http://schemas.microsoft.com/office/word/2006/wordml" xmlns:wps="http://schemas.microsoft.com/office/word/2010/wordprocessingShape" mc:Ignorable="w14 wp14">
   <w:body>
     <w:p>
-      <w:pPr>
-        <w:spacing w:after="40"/>
-      </w:pPr>
       <w:r>
-        <w:rPr>
-          <w:b/>
-          <w:color w:val="0F766E"/>
-          <w:sz w:val="18"/>
-        </w:rPr>
         <w:t>ARCHITECTURE &amp; VISION BOOK  ·  v0.4  ·  ENGLISH EDITION</w:t>
       </w:r>
     </w:p>
     <w:p>
       <w:pPr>
-        <w:spacing w:after="0"/>
+        <w:pStyle w:val="Title"/>
       </w:pPr>
       <w:r>
-        <w:rPr>
-          <w:b/>
-          <w:color w:val="17324D"/>
-          <w:sz w:val="52"/>
-        </w:rPr>
         <w:t>Waaxalma</w:t>
       </w:r>
     </w:p>
     <w:p>
       <w:pPr>
-        <w:spacing w:after="40"/>
+        <w:pStyle w:val="Subtitle"/>
       </w:pPr>
       <w:r>
-        <w:rPr>
-          <w:color w:val="2E74B5"/>
-          <w:sz w:val="27"/>
-        </w:rPr>
-        <w:t>From a reliable voice pipeline to an extensible voice-agent framework</w:t>
+        <w:t>Framework Next</w:t>
       </w:r>
     </w:p>
     <w:p>
-      <w:pPr>
-        <w:spacing w:after="160"/>
-      </w:pPr>
       <w:r>
-        <w:rPr>
-          <w:color w:val="667085"/>
-          <w:sz w:val="18"/>
-        </w:rPr>
-        <w:t>22 September 2026  ·  Framework Next architecture  ·  Repository milestone v0.4.0</w:t>
+        <w:t>22 September 2026  ·  Framework Next</w:t>
       </w:r>
     </w:p>
     <w:p>
-      <w:pPr>
-        <w:spacing w:after="100"/>
-      </w:pPr>
       <w:r>
         <w:rPr>
           <w:b/>
-          <w:color w:val="0F766E"/>
-          <w:sz w:val="19"/>
+          <w:color w:val="07847E"/>
         </w:rPr>
         <w:t xml:space="preserve">VISION  </w:t>
       </w:r>
       <w:r>
-        <w:rPr>
-          <w:color w:val="1F2937"/>
-          <w:sz w:val="19"/>
-        </w:rPr>
-        <w:t>Waaxalma (“speak for me”) turns speech — particularly in Wolof — into understandable translated text and natural audio. v0.4 turns the reliable application core into a reusable framework where agents, providers and pipelines can evolve independently.</w:t>
+        <w:t>Waaxalma (“speak for me”) turns speech, particularly in Wolof, into understandable translated text and natural audio. The product seeks to preserve intent; the framework separates replaceable agents, pipelines and provider capabilities.</w:t>
       </w:r>
     </w:p>
     <w:p>
@@ -82,34 +50,23 @@
     </w:p>
     <w:p>
       <w:r>
-        <w:t>The product goal remains simple: capture speech, preserve intent, produce an actionable translation and return natural-sounding audio. The framework goal is broader: make each capability replaceable, composable, observable and independently testable without breaking public interfaces.</w:t>
+        <w:t>This edition records the v0.4 milestone. It retains the architecture template from v0.4 and the capabilities delivered at this point; later milestones remain future work in this historical edition.</w:t>
       </w:r>
     </w:p>
     <w:p>
       <w:pPr>
         <w:pStyle w:val="ListBullet"/>
-        <w:spacing w:after="60"/>
       </w:pPr>
       <w:r>
-        <w:t>Inputs — microphone audio or a file, plus a text mode for testing and non-voice use cases.</w:t>
+        <w:t>AgentRegistry, ProviderRegistry and PipelineRegistry make discovery and composition explicit.</w:t>
       </w:r>
     </w:p>
     <w:p>
       <w:pPr>
         <w:pStyle w:val="ListBullet"/>
-        <w:spacing w:after="60"/>
       </w:pPr>
       <w:r>
-        <w:t>Outputs — source text, interpreted text, generated audio, session metadata and quality information.</w:t>
-      </w:r>
-    </w:p>
-    <w:p>
-      <w:pPr>
-        <w:pStyle w:val="ListBullet"/>
-        <w:spacing w:after="60"/>
-      </w:pPr>
-      <w:r>
-        <w:t>Direction — use registries, typed contracts and configurable pipelines instead of hard-coded service or provider choices.</w:t>
+        <w:t>InterpreterAgent receives named text/audio pipelines. Context and Quality are agents, Skills, providers and pipeline stages.</w:t>
       </w:r>
     </w:p>
     <w:p>
@@ -122,35 +79,49 @@
     </w:p>
     <w:tbl>
       <w:tblPr>
-        <w:tblStyle w:val="TableGrid"/>
         <w:tblW w:type="auto" w:w="0"/>
-        <w:jc w:val="center"/>
+        <w:tblLayout w:type="fixed"/>
         <w:tblLook w:firstColumn="1" w:firstRow="1" w:lastColumn="0" w:lastRow="0" w:noHBand="0" w:noVBand="1" w:val="04A0"/>
+        <w:tblBorders>
+          <w:top w:val="single" w:sz="4" w:color="D9D9D9"/>
+          <w:bottom w:val="single" w:sz="4" w:color="D9D9D9"/>
+          <w:left w:val="single" w:sz="4" w:color="D9D9D9"/>
+          <w:right w:val="single" w:sz="4" w:color="D9D9D9"/>
+          <w:insideH w:val="single" w:sz="4" w:color="D9D9D9"/>
+          <w:insideV w:val="single" w:sz="4" w:color="D9D9D9"/>
+        </w:tblBorders>
       </w:tblPr>
       <w:tblGrid>
-        <w:gridCol w:w="3360"/>
-        <w:gridCol w:w="3360"/>
-        <w:gridCol w:w="3360"/>
+        <w:gridCol w:w="1584"/>
+        <w:gridCol w:w="3744"/>
+        <w:gridCol w:w="4752"/>
       </w:tblGrid>
       <w:tr>
+        <w:trPr>
+          <w:cantSplit/>
+          <w:tblHeader/>
+        </w:trPr>
         <w:tc>
           <w:tcPr>
-            <w:tcW w:type="dxa" w:w="1512"/>
-            <w:shd w:fill="17324D"/>
+            <w:tcW w:type="dxa" w:w="1584"/>
             <w:vAlign w:val="center"/>
+            <w:shd w:fill="19364D"/>
             <w:tcMar>
-              <w:top w:w="70" w:type="dxa"/>
-              <w:start w:w="80" w:type="dxa"/>
-              <w:bottom w:w="70" w:type="dxa"/>
-              <w:end w:w="80" w:type="dxa"/>
+              <w:top w:w="80" w:type="dxa"/>
+              <w:bottom w:w="80" w:type="dxa"/>
+              <w:left w:w="80" w:type="dxa"/>
+              <w:right w:w="80" w:type="dxa"/>
             </w:tcMar>
           </w:tcPr>
           <w:p>
+            <w:pPr>
+              <w:spacing w:after="60" w:line="240" w:lineRule="auto"/>
+            </w:pPr>
             <w:r>
               <w:rPr>
                 <w:b/>
                 <w:color w:val="FFFFFF"/>
-                <w:sz w:val="15"/>
+                <w:sz w:val="18"/>
               </w:rPr>
               <w:t>Layer</w:t>
             </w:r>
@@ -158,69 +129,82 @@
         </w:tc>
         <w:tc>
           <w:tcPr>
-            <w:tcW w:type="dxa" w:w="2232"/>
-            <w:shd w:fill="17324D"/>
+            <w:tcW w:type="dxa" w:w="3744"/>
             <w:vAlign w:val="center"/>
+            <w:shd w:fill="19364D"/>
             <w:tcMar>
-              <w:top w:w="70" w:type="dxa"/>
-              <w:start w:w="80" w:type="dxa"/>
-              <w:bottom w:w="70" w:type="dxa"/>
-              <w:end w:w="80" w:type="dxa"/>
+              <w:top w:w="80" w:type="dxa"/>
+              <w:bottom w:w="80" w:type="dxa"/>
+              <w:left w:w="80" w:type="dxa"/>
+              <w:right w:w="80" w:type="dxa"/>
             </w:tcMar>
           </w:tcPr>
           <w:p>
+            <w:pPr>
+              <w:spacing w:after="60" w:line="240" w:lineRule="auto"/>
+            </w:pPr>
             <w:r>
               <w:rPr>
                 <w:b/>
                 <w:color w:val="FFFFFF"/>
-                <w:sz w:val="15"/>
+                <w:sz w:val="18"/>
               </w:rPr>
-              <w:t>v0.4 state</w:t>
+              <w:t>Implementation</w:t>
             </w:r>
           </w:p>
         </w:tc>
         <w:tc>
           <w:tcPr>
-            <w:tcW w:type="dxa" w:w="5616"/>
-            <w:shd w:fill="17324D"/>
+            <w:tcW w:type="dxa" w:w="4752"/>
             <w:vAlign w:val="center"/>
+            <w:shd w:fill="19364D"/>
             <w:tcMar>
-              <w:top w:w="70" w:type="dxa"/>
-              <w:start w:w="80" w:type="dxa"/>
-              <w:bottom w:w="70" w:type="dxa"/>
-              <w:end w:w="80" w:type="dxa"/>
+              <w:top w:w="80" w:type="dxa"/>
+              <w:bottom w:w="80" w:type="dxa"/>
+              <w:left w:w="80" w:type="dxa"/>
+              <w:right w:w="80" w:type="dxa"/>
             </w:tcMar>
           </w:tcPr>
           <w:p>
+            <w:pPr>
+              <w:spacing w:after="60" w:line="240" w:lineRule="auto"/>
+            </w:pPr>
             <w:r>
               <w:rPr>
                 <w:b/>
                 <w:color w:val="FFFFFF"/>
-                <w:sz w:val="15"/>
+                <w:sz w:val="18"/>
               </w:rPr>
-              <w:t>Architectural interpretation</w:t>
+              <w:t>Meaning</w:t>
             </w:r>
           </w:p>
         </w:tc>
       </w:tr>
       <w:tr>
+        <w:trPr>
+          <w:cantSplit/>
+        </w:trPr>
         <w:tc>
           <w:tcPr>
-            <w:tcW w:type="dxa" w:w="1512"/>
+            <w:tcW w:type="dxa" w:w="1584"/>
             <w:vAlign w:val="center"/>
+            <w:shd w:fill="FFFFFF"/>
             <w:tcMar>
-              <w:top w:w="70" w:type="dxa"/>
-              <w:start w:w="80" w:type="dxa"/>
-              <w:bottom w:w="70" w:type="dxa"/>
-              <w:end w:w="80" w:type="dxa"/>
+              <w:top w:w="80" w:type="dxa"/>
+              <w:bottom w:w="80" w:type="dxa"/>
+              <w:left w:w="80" w:type="dxa"/>
+              <w:right w:w="80" w:type="dxa"/>
             </w:tcMar>
           </w:tcPr>
           <w:p>
+            <w:pPr>
+              <w:spacing w:after="60" w:line="240" w:lineRule="auto"/>
+            </w:pPr>
             <w:r>
               <w:rPr>
                 <w:b w:val="0"/>
-                <w:color w:val="1F2937"/>
-                <w:sz w:val="15"/>
+                <w:color w:val="273444"/>
+                <w:sz w:val="18"/>
               </w:rPr>
               <w:t>API</w:t>
             </w:r>
@@ -228,68 +212,82 @@
         </w:tc>
         <w:tc>
           <w:tcPr>
-            <w:tcW w:type="dxa" w:w="2232"/>
+            <w:tcW w:type="dxa" w:w="3744"/>
             <w:vAlign w:val="center"/>
+            <w:shd w:fill="FFFFFF"/>
             <w:tcMar>
-              <w:top w:w="70" w:type="dxa"/>
-              <w:start w:w="80" w:type="dxa"/>
-              <w:bottom w:w="70" w:type="dxa"/>
-              <w:end w:w="80" w:type="dxa"/>
+              <w:top w:w="80" w:type="dxa"/>
+              <w:bottom w:w="80" w:type="dxa"/>
+              <w:left w:w="80" w:type="dxa"/>
+              <w:right w:w="80" w:type="dxa"/>
             </w:tcMar>
           </w:tcPr>
           <w:p>
+            <w:pPr>
+              <w:spacing w:after="60" w:line="240" w:lineRule="auto"/>
+            </w:pPr>
             <w:r>
               <w:rPr>
                 <w:b w:val="0"/>
-                <w:color w:val="1F2937"/>
-                <w:sz w:val="15"/>
+                <w:color w:val="273444"/>
+                <w:sz w:val="18"/>
               </w:rPr>
-              <w:t>Generic FastAPI API</w:t>
+              <w:t>FastAPI</w:t>
             </w:r>
           </w:p>
         </w:tc>
         <w:tc>
           <w:tcPr>
-            <w:tcW w:type="dxa" w:w="5616"/>
+            <w:tcW w:type="dxa" w:w="4752"/>
             <w:vAlign w:val="center"/>
+            <w:shd w:fill="FFFFFF"/>
             <w:tcMar>
-              <w:top w:w="70" w:type="dxa"/>
-              <w:start w:w="80" w:type="dxa"/>
-              <w:bottom w:w="70" w:type="dxa"/>
-              <w:end w:w="80" w:type="dxa"/>
+              <w:top w:w="80" w:type="dxa"/>
+              <w:bottom w:w="80" w:type="dxa"/>
+              <w:left w:w="80" w:type="dxa"/>
+              <w:right w:w="80" w:type="dxa"/>
             </w:tcMar>
           </w:tcPr>
           <w:p>
+            <w:pPr>
+              <w:spacing w:after="60" w:line="240" w:lineRule="auto"/>
+            </w:pPr>
             <w:r>
               <w:rPr>
                 <w:b w:val="0"/>
-                <w:color w:val="1F2937"/>
-                <w:sz w:val="15"/>
+                <w:color w:val="273444"/>
+                <w:sz w:val="18"/>
               </w:rPr>
-              <w:t>One execution endpoint resolves any registered agent by name.</w:t>
+              <w:t>Generic registered-agent execution; text/voice routes.</w:t>
             </w:r>
           </w:p>
         </w:tc>
       </w:tr>
       <w:tr>
+        <w:trPr>
+          <w:cantSplit/>
+        </w:trPr>
         <w:tc>
           <w:tcPr>
-            <w:tcW w:type="dxa" w:w="1512"/>
+            <w:tcW w:type="dxa" w:w="1584"/>
             <w:vAlign w:val="center"/>
-            <w:shd w:fill="F5F7FA"/>
+            <w:shd w:fill="F3F6F9"/>
             <w:tcMar>
-              <w:top w:w="70" w:type="dxa"/>
-              <w:start w:w="80" w:type="dxa"/>
-              <w:bottom w:w="70" w:type="dxa"/>
-              <w:end w:w="80" w:type="dxa"/>
+              <w:top w:w="80" w:type="dxa"/>
+              <w:bottom w:w="80" w:type="dxa"/>
+              <w:left w:w="80" w:type="dxa"/>
+              <w:right w:w="80" w:type="dxa"/>
             </w:tcMar>
           </w:tcPr>
           <w:p>
+            <w:pPr>
+              <w:spacing w:after="60" w:line="240" w:lineRule="auto"/>
+            </w:pPr>
             <w:r>
               <w:rPr>
                 <w:b w:val="0"/>
-                <w:color w:val="1F2937"/>
-                <w:sz w:val="15"/>
+                <w:color w:val="273444"/>
+                <w:sz w:val="18"/>
               </w:rPr>
               <w:t>Orchestration</w:t>
             </w:r>
@@ -297,22 +295,25 @@
         </w:tc>
         <w:tc>
           <w:tcPr>
-            <w:tcW w:type="dxa" w:w="2232"/>
+            <w:tcW w:type="dxa" w:w="3744"/>
             <w:vAlign w:val="center"/>
-            <w:shd w:fill="F5F7FA"/>
+            <w:shd w:fill="F3F6F9"/>
             <w:tcMar>
-              <w:top w:w="70" w:type="dxa"/>
-              <w:start w:w="80" w:type="dxa"/>
-              <w:bottom w:w="70" w:type="dxa"/>
-              <w:end w:w="80" w:type="dxa"/>
+              <w:top w:w="80" w:type="dxa"/>
+              <w:bottom w:w="80" w:type="dxa"/>
+              <w:left w:w="80" w:type="dxa"/>
+              <w:right w:w="80" w:type="dxa"/>
             </w:tcMar>
           </w:tcPr>
           <w:p>
+            <w:pPr>
+              <w:spacing w:after="60" w:line="240" w:lineRule="auto"/>
+            </w:pPr>
             <w:r>
               <w:rPr>
                 <w:b w:val="0"/>
-                <w:color w:val="1F2937"/>
-                <w:sz w:val="15"/>
+                <w:color w:val="273444"/>
+                <w:sz w:val="18"/>
               </w:rPr>
               <w:t>AgentOrchestrator</w:t>
             </w:r>
@@ -320,46 +321,56 @@
         </w:tc>
         <w:tc>
           <w:tcPr>
-            <w:tcW w:type="dxa" w:w="5616"/>
+            <w:tcW w:type="dxa" w:w="4752"/>
             <w:vAlign w:val="center"/>
-            <w:shd w:fill="F5F7FA"/>
+            <w:shd w:fill="F3F6F9"/>
             <w:tcMar>
-              <w:top w:w="70" w:type="dxa"/>
-              <w:start w:w="80" w:type="dxa"/>
-              <w:bottom w:w="70" w:type="dxa"/>
-              <w:end w:w="80" w:type="dxa"/>
+              <w:top w:w="80" w:type="dxa"/>
+              <w:bottom w:w="80" w:type="dxa"/>
+              <w:left w:w="80" w:type="dxa"/>
+              <w:right w:w="80" w:type="dxa"/>
             </w:tcMar>
           </w:tcPr>
           <w:p>
+            <w:pPr>
+              <w:spacing w:after="60" w:line="240" w:lineRule="auto"/>
+            </w:pPr>
             <w:r>
               <w:rPr>
                 <w:b w:val="0"/>
-                <w:color w:val="1F2937"/>
-                <w:sz w:val="15"/>
+                <w:color w:val="273444"/>
+                <w:sz w:val="18"/>
               </w:rPr>
-              <w:t>Executes agents with normalized results, error mapping, timing and cancellation behavior.</w:t>
+              <w:t>Results, errors, timing and cancellation.</w:t>
             </w:r>
           </w:p>
         </w:tc>
       </w:tr>
       <w:tr>
+        <w:trPr>
+          <w:cantSplit/>
+        </w:trPr>
         <w:tc>
           <w:tcPr>
-            <w:tcW w:type="dxa" w:w="1512"/>
+            <w:tcW w:type="dxa" w:w="1584"/>
             <w:vAlign w:val="center"/>
+            <w:shd w:fill="FFFFFF"/>
             <w:tcMar>
-              <w:top w:w="70" w:type="dxa"/>
-              <w:start w:w="80" w:type="dxa"/>
-              <w:bottom w:w="70" w:type="dxa"/>
-              <w:end w:w="80" w:type="dxa"/>
+              <w:top w:w="80" w:type="dxa"/>
+              <w:bottom w:w="80" w:type="dxa"/>
+              <w:left w:w="80" w:type="dxa"/>
+              <w:right w:w="80" w:type="dxa"/>
             </w:tcMar>
           </w:tcPr>
           <w:p>
+            <w:pPr>
+              <w:spacing w:after="60" w:line="240" w:lineRule="auto"/>
+            </w:pPr>
             <w:r>
               <w:rPr>
                 <w:b w:val="0"/>
-                <w:color w:val="1F2937"/>
-                <w:sz w:val="15"/>
+                <w:color w:val="273444"/>
+                <w:sz w:val="18"/>
               </w:rPr>
               <w:t>Discovery</w:t>
             </w:r>
@@ -367,68 +378,82 @@
         </w:tc>
         <w:tc>
           <w:tcPr>
-            <w:tcW w:type="dxa" w:w="2232"/>
+            <w:tcW w:type="dxa" w:w="3744"/>
             <w:vAlign w:val="center"/>
+            <w:shd w:fill="FFFFFF"/>
             <w:tcMar>
-              <w:top w:w="70" w:type="dxa"/>
-              <w:start w:w="80" w:type="dxa"/>
-              <w:bottom w:w="70" w:type="dxa"/>
-              <w:end w:w="80" w:type="dxa"/>
+              <w:top w:w="80" w:type="dxa"/>
+              <w:bottom w:w="80" w:type="dxa"/>
+              <w:left w:w="80" w:type="dxa"/>
+              <w:right w:w="80" w:type="dxa"/>
             </w:tcMar>
           </w:tcPr>
           <w:p>
+            <w:pPr>
+              <w:spacing w:after="60" w:line="240" w:lineRule="auto"/>
+            </w:pPr>
             <w:r>
               <w:rPr>
                 <w:b w:val="0"/>
-                <w:color w:val="1F2937"/>
-                <w:sz w:val="15"/>
+                <w:color w:val="273444"/>
+                <w:sz w:val="18"/>
               </w:rPr>
-              <w:t>AgentRegistry</w:t>
+              <w:t>AgentRegistry / ProviderRegistry</w:t>
             </w:r>
           </w:p>
         </w:tc>
         <w:tc>
           <w:tcPr>
-            <w:tcW w:type="dxa" w:w="5616"/>
+            <w:tcW w:type="dxa" w:w="4752"/>
             <w:vAlign w:val="center"/>
+            <w:shd w:fill="FFFFFF"/>
             <w:tcMar>
-              <w:top w:w="70" w:type="dxa"/>
-              <w:start w:w="80" w:type="dxa"/>
-              <w:bottom w:w="70" w:type="dxa"/>
-              <w:end w:w="80" w:type="dxa"/>
+              <w:top w:w="80" w:type="dxa"/>
+              <w:bottom w:w="80" w:type="dxa"/>
+              <w:left w:w="80" w:type="dxa"/>
+              <w:right w:w="80" w:type="dxa"/>
             </w:tcMar>
           </w:tcPr>
           <w:p>
+            <w:pPr>
+              <w:spacing w:after="60" w:line="240" w:lineRule="auto"/>
+            </w:pPr>
             <w:r>
               <w:rPr>
                 <w:b w:val="0"/>
-                <w:color w:val="1F2937"/>
-                <w:sz w:val="15"/>
+                <w:color w:val="273444"/>
+                <w:sz w:val="18"/>
               </w:rPr>
-              <w:t>Single source of truth for available agents.</w:t>
+              <w:t>Explicit resolution by name and capability.</w:t>
             </w:r>
           </w:p>
         </w:tc>
       </w:tr>
       <w:tr>
+        <w:trPr>
+          <w:cantSplit/>
+        </w:trPr>
         <w:tc>
           <w:tcPr>
-            <w:tcW w:type="dxa" w:w="1512"/>
+            <w:tcW w:type="dxa" w:w="1584"/>
             <w:vAlign w:val="center"/>
-            <w:shd w:fill="F5F7FA"/>
+            <w:shd w:fill="F3F6F9"/>
             <w:tcMar>
-              <w:top w:w="70" w:type="dxa"/>
-              <w:start w:w="80" w:type="dxa"/>
-              <w:bottom w:w="70" w:type="dxa"/>
-              <w:end w:w="80" w:type="dxa"/>
+              <w:top w:w="80" w:type="dxa"/>
+              <w:bottom w:w="80" w:type="dxa"/>
+              <w:left w:w="80" w:type="dxa"/>
+              <w:right w:w="80" w:type="dxa"/>
             </w:tcMar>
           </w:tcPr>
           <w:p>
+            <w:pPr>
+              <w:spacing w:after="60" w:line="240" w:lineRule="auto"/>
+            </w:pPr>
             <w:r>
               <w:rPr>
                 <w:b w:val="0"/>
-                <w:color w:val="1F2937"/>
-                <w:sz w:val="15"/>
+                <w:color w:val="273444"/>
+                <w:sz w:val="18"/>
               </w:rPr>
               <w:t>Composition</w:t>
             </w:r>
@@ -436,191 +461,63 @@
         </w:tc>
         <w:tc>
           <w:tcPr>
-            <w:tcW w:type="dxa" w:w="2232"/>
+            <w:tcW w:type="dxa" w:w="3744"/>
             <w:vAlign w:val="center"/>
-            <w:shd w:fill="F5F7FA"/>
+            <w:shd w:fill="F3F6F9"/>
             <w:tcMar>
-              <w:top w:w="70" w:type="dxa"/>
-              <w:start w:w="80" w:type="dxa"/>
-              <w:bottom w:w="70" w:type="dxa"/>
-              <w:end w:w="80" w:type="dxa"/>
+              <w:top w:w="80" w:type="dxa"/>
+              <w:bottom w:w="80" w:type="dxa"/>
+              <w:left w:w="80" w:type="dxa"/>
+              <w:right w:w="80" w:type="dxa"/>
             </w:tcMar>
           </w:tcPr>
           <w:p>
+            <w:pPr>
+              <w:spacing w:after="60" w:line="240" w:lineRule="auto"/>
+            </w:pPr>
             <w:r>
               <w:rPr>
                 <w:b w:val="0"/>
-                <w:color w:val="1F2937"/>
-                <w:sz w:val="15"/>
+                <w:color w:val="273444"/>
+                <w:sz w:val="18"/>
               </w:rPr>
-              <w:t>PipelineRegistry</w:t>
+              <w:t>PipelineRegistry / SequentialPipeline</w:t>
             </w:r>
           </w:p>
         </w:tc>
         <w:tc>
           <w:tcPr>
-            <w:tcW w:type="dxa" w:w="5616"/>
+            <w:tcW w:type="dxa" w:w="4752"/>
             <w:vAlign w:val="center"/>
-            <w:shd w:fill="F5F7FA"/>
+            <w:shd w:fill="F3F6F9"/>
             <w:tcMar>
-              <w:top w:w="70" w:type="dxa"/>
-              <w:start w:w="80" w:type="dxa"/>
-              <w:bottom w:w="70" w:type="dxa"/>
-              <w:end w:w="80" w:type="dxa"/>
+              <w:top w:w="80" w:type="dxa"/>
+              <w:bottom w:w="80" w:type="dxa"/>
+              <w:left w:w="80" w:type="dxa"/>
+              <w:right w:w="80" w:type="dxa"/>
             </w:tcMar>
           </w:tcPr>
           <w:p>
+            <w:pPr>
+              <w:spacing w:after="60" w:line="240" w:lineRule="auto"/>
+            </w:pPr>
             <w:r>
               <w:rPr>
                 <w:b w:val="0"/>
-                <w:color w:val="1F2937"/>
-                <w:sz w:val="15"/>
+                <w:color w:val="273444"/>
+                <w:sz w:val="18"/>
               </w:rPr>
-              <w:t>Named text and audio workflows built from reusable stages.</w:t>
-            </w:r>
-          </w:p>
-        </w:tc>
-      </w:tr>
-      <w:tr>
-        <w:tc>
-          <w:tcPr>
-            <w:tcW w:type="dxa" w:w="1512"/>
-            <w:vAlign w:val="center"/>
-            <w:tcMar>
-              <w:top w:w="70" w:type="dxa"/>
-              <w:start w:w="80" w:type="dxa"/>
-              <w:bottom w:w="70" w:type="dxa"/>
-              <w:end w:w="80" w:type="dxa"/>
-            </w:tcMar>
-          </w:tcPr>
-          <w:p>
-            <w:r>
-              <w:rPr>
-                <w:b w:val="0"/>
-                <w:color w:val="1F2937"/>
-                <w:sz w:val="15"/>
-              </w:rPr>
-              <w:t>Providers</w:t>
-            </w:r>
-          </w:p>
-        </w:tc>
-        <w:tc>
-          <w:tcPr>
-            <w:tcW w:type="dxa" w:w="2232"/>
-            <w:vAlign w:val="center"/>
-            <w:tcMar>
-              <w:top w:w="70" w:type="dxa"/>
-              <w:start w:w="80" w:type="dxa"/>
-              <w:bottom w:w="70" w:type="dxa"/>
-              <w:end w:w="80" w:type="dxa"/>
-            </w:tcMar>
-          </w:tcPr>
-          <w:p>
-            <w:r>
-              <w:rPr>
-                <w:b w:val="0"/>
-                <w:color w:val="1F2937"/>
-                <w:sz w:val="15"/>
-              </w:rPr>
-              <w:t>ProviderRegistry</w:t>
-            </w:r>
-          </w:p>
-        </w:tc>
-        <w:tc>
-          <w:tcPr>
-            <w:tcW w:type="dxa" w:w="5616"/>
-            <w:vAlign w:val="center"/>
-            <w:tcMar>
-              <w:top w:w="70" w:type="dxa"/>
-              <w:start w:w="80" w:type="dxa"/>
-              <w:bottom w:w="70" w:type="dxa"/>
-              <w:end w:w="80" w:type="dxa"/>
-            </w:tcMar>
-          </w:tcPr>
-          <w:p>
-            <w:r>
-              <w:rPr>
-                <w:b w:val="0"/>
-                <w:color w:val="1F2937"/>
-                <w:sz w:val="15"/>
-              </w:rPr>
-              <w:t>Resolves interchangeable implementations by capability and provider name.</w:t>
-            </w:r>
-          </w:p>
-        </w:tc>
-      </w:tr>
-      <w:tr>
-        <w:tc>
-          <w:tcPr>
-            <w:tcW w:type="dxa" w:w="1512"/>
-            <w:vAlign w:val="center"/>
-            <w:shd w:fill="F5F7FA"/>
-            <w:tcMar>
-              <w:top w:w="70" w:type="dxa"/>
-              <w:start w:w="80" w:type="dxa"/>
-              <w:bottom w:w="70" w:type="dxa"/>
-              <w:end w:w="80" w:type="dxa"/>
-            </w:tcMar>
-          </w:tcPr>
-          <w:p>
-            <w:r>
-              <w:rPr>
-                <w:b w:val="0"/>
-                <w:color w:val="1F2937"/>
-                <w:sz w:val="15"/>
-              </w:rPr>
-              <w:t>Reliability</w:t>
-            </w:r>
-          </w:p>
-        </w:tc>
-        <w:tc>
-          <w:tcPr>
-            <w:tcW w:type="dxa" w:w="2232"/>
-            <w:vAlign w:val="center"/>
-            <w:shd w:fill="F5F7FA"/>
-            <w:tcMar>
-              <w:top w:w="70" w:type="dxa"/>
-              <w:start w:w="80" w:type="dxa"/>
-              <w:bottom w:w="70" w:type="dxa"/>
-              <w:end w:w="80" w:type="dxa"/>
-            </w:tcMar>
-          </w:tcPr>
-          <w:p>
-            <w:r>
-              <w:rPr>
-                <w:b w:val="0"/>
-                <w:color w:val="1F2937"/>
-                <w:sz w:val="15"/>
-              </w:rPr>
-              <w:t>v0.3 foundation</w:t>
-            </w:r>
-          </w:p>
-        </w:tc>
-        <w:tc>
-          <w:tcPr>
-            <w:tcW w:type="dxa" w:w="5616"/>
-            <w:vAlign w:val="center"/>
-            <w:shd w:fill="F5F7FA"/>
-            <w:tcMar>
-              <w:top w:w="70" w:type="dxa"/>
-              <w:start w:w="80" w:type="dxa"/>
-              <w:bottom w:w="70" w:type="dxa"/>
-              <w:end w:w="80" w:type="dxa"/>
-            </w:tcMar>
-          </w:tcPr>
-          <w:p>
-            <w:r>
-              <w:rPr>
-                <w:b w:val="0"/>
-                <w:color w:val="1F2937"/>
-                <w:sz w:val="15"/>
-              </w:rPr>
-              <w:t>Validation, timeouts, retries, tracing, metrics and normalized failures remain cross-cutting.</w:t>
+              <w:t>Ordered reusable stages.</w:t>
             </w:r>
           </w:p>
         </w:tc>
       </w:tr>
     </w:tbl>
+    <w:p>
+      <w:pPr>
+        <w:spacing w:after="0"/>
+      </w:pPr>
+    </w:p>
     <w:p>
       <w:pPr>
         <w:pStyle w:val="Heading2"/>
@@ -632,64 +529,25 @@
     <w:p>
       <w:pPr>
         <w:pStyle w:val="ListBullet"/>
-        <w:spacing w:after="60"/>
       </w:pPr>
       <w:r>
-        <w:t>Stable API — new agents do not require agent-specific FastAPI routes.</w:t>
+        <w:t>Extend through contracts, registration and composition; fail early for unknown providers/pipelines.</w:t>
       </w:r>
     </w:p>
     <w:p>
       <w:pPr>
         <w:pStyle w:val="ListBullet"/>
-        <w:spacing w:after="60"/>
       </w:pPr>
       <w:r>
-        <w:t>Dependency inversion — Skills depend on provider contracts, not concrete providers.</w:t>
+        <w:t>Skills depend on capability contracts. Reliability and observability stay cross-cutting. Context/Quality defaults add no extra LLM call.</w:t>
       </w:r>
     </w:p>
     <w:p>
       <w:pPr>
         <w:pStyle w:val="ListBullet"/>
-        <w:spacing w:after="60"/>
       </w:pPr>
       <w:r>
-        <w:t>Registries as sources of truth — agent, provider and pipeline discovery is explicit and testable.</w:t>
-      </w:r>
-    </w:p>
-    <w:p>
-      <w:pPr>
-        <w:pStyle w:val="ListBullet"/>
-        <w:spacing w:after="60"/>
-      </w:pPr>
-      <w:r>
-        <w:t>Composable workflows — agent behavior is assembled from ordered pipeline stages rather than embedded orchestration logic.</w:t>
-      </w:r>
-    </w:p>
-    <w:p>
-      <w:pPr>
-        <w:pStyle w:val="ListBullet"/>
-        <w:spacing w:after="60"/>
-      </w:pPr>
-      <w:r>
-        <w:t>Fail fast — invalid provider or pipeline configuration fails at composition time instead of silently falling back.</w:t>
-      </w:r>
-    </w:p>
-    <w:p>
-      <w:pPr>
-        <w:pStyle w:val="ListBullet"/>
-        <w:spacing w:after="60"/>
-      </w:pPr>
-      <w:r>
-        <w:t>Observable by default — session context, tracing, metrics and normalized errors remain part of every execution.</w:t>
-      </w:r>
-    </w:p>
-    <w:p>
-      <w:pPr>
-        <w:pStyle w:val="ListBullet"/>
-        <w:spacing w:after="60"/>
-      </w:pPr>
-      <w:r>
-        <w:t>Cost-aware defaults — Context and Quality are fully integrated without forcing additional LLM calls.</w:t>
+        <w:t>Separate standard workflows, realtime transports and browser devices; describe validation limits explicitly.</w:t>
       </w:r>
     </w:p>
     <w:p>
@@ -702,22 +560,19 @@
         <w:pStyle w:val="Heading1"/>
       </w:pPr>
       <w:r>
-        <w:t>4. Current architecture — v0.4</w:t>
+        <w:t>4. Current architecture</w:t>
       </w:r>
     </w:p>
     <w:p>
-      <w:pPr>
-        <w:spacing w:after="120"/>
-      </w:pPr>
       <w:r>
-        <w:t>v0.4 separates API routing, agent discovery, pipeline composition, capability contracts and concrete provider selection. The composition root is the only layer that knows how concrete implementations are assembled.</w:t>
+        <w:t>The composition root assembles concrete providers, Skills, stages, pipelines and agents. Registries resolve dependencies rather than adding processing stages to every request.</w:t>
       </w:r>
     </w:p>
     <w:p>
       <w:r>
         <w:drawing>
           <wp:inline xmlns:a="http://schemas.openxmlformats.org/drawingml/2006/main" xmlns:pic="http://schemas.openxmlformats.org/drawingml/2006/picture">
-            <wp:extent cx="6126480" cy="3588367"/>
+            <wp:extent cx="6400800" cy="3400425"/>
             <wp:docPr id="1" name="Picture 1"/>
             <wp:cNvGraphicFramePr>
               <a:graphicFrameLocks noChangeAspect="1"/>
@@ -726,11 +581,11 @@
               <a:graphicData uri="http://schemas.openxmlformats.org/drawingml/2006/picture">
                 <pic:pic>
                   <pic:nvPicPr>
-                    <pic:cNvPr id="0" name="waaxalma_v04_architecture.png"/>
+                    <pic:cNvPr id="0" name="v0.4_architecture_EN.png"/>
                     <pic:cNvPicPr/>
                   </pic:nvPicPr>
                   <pic:blipFill>
-                    <a:blip r:embed="rId11"/>
+                    <a:blip r:embed="rId13"/>
                     <a:stretch>
                       <a:fillRect/>
                     </a:stretch>
@@ -738,7 +593,7 @@
                   <pic:spPr>
                     <a:xfrm>
                       <a:off x="0" y="0"/>
-                      <a:ext cx="6126480" cy="3588367"/>
+                      <a:ext cx="6400800" cy="3400425"/>
                     </a:xfrm>
                     <a:prstGeom prst="rect"/>
                   </pic:spPr>
@@ -750,15 +605,8 @@
       </w:r>
     </w:p>
     <w:p>
-      <w:pPr>
-        <w:spacing w:before="80" w:after="140"/>
-      </w:pPr>
       <w:r>
-        <w:rPr>
-          <w:color w:val="667085"/>
-          <w:sz w:val="16"/>
-        </w:rPr>
-        <w:t>Reading: the generic API delegates execution to AgentOrchestrator; registries resolve agents, pipelines and providers; reliability and observability remain cross-cutting concerns.</w:t>
+        <w:t>AgentOrchestrator executes registered agents; InterpreterAgent receives its configured text/audio pipelines. Realtime services, where delivered, remain separate from this standard chain.</w:t>
       </w:r>
     </w:p>
     <w:p>
@@ -773,7 +621,7 @@
       <w:r>
         <w:drawing>
           <wp:inline xmlns:a="http://schemas.openxmlformats.org/drawingml/2006/main" xmlns:pic="http://schemas.openxmlformats.org/drawingml/2006/picture">
-            <wp:extent cx="6126480" cy="1925465"/>
+            <wp:extent cx="6400800" cy="1800225"/>
             <wp:docPr id="2" name="Picture 2"/>
             <wp:cNvGraphicFramePr>
               <a:graphicFrameLocks noChangeAspect="1"/>
@@ -782,11 +630,11 @@
               <a:graphicData uri="http://schemas.openxmlformats.org/drawingml/2006/picture">
                 <pic:pic>
                   <pic:nvPicPr>
-                    <pic:cNvPr id="0" name="waaxalma_v04_flows.png"/>
+                    <pic:cNvPr id="0" name="v0.4_standard_EN.png"/>
                     <pic:cNvPicPr/>
                   </pic:nvPicPr>
                   <pic:blipFill>
-                    <a:blip r:embed="rId12"/>
+                    <a:blip r:embed="rId14"/>
                     <a:stretch>
                       <a:fillRect/>
                     </a:stretch>
@@ -794,7 +642,7 @@
                   <pic:spPr>
                     <a:xfrm>
                       <a:off x="0" y="0"/>
-                      <a:ext cx="6126480" cy="1925465"/>
+                      <a:ext cx="6400800" cy="1800225"/>
                     </a:xfrm>
                     <a:prstGeom prst="rect"/>
                   </pic:spPr>
@@ -806,23 +654,15 @@
       </w:r>
     </w:p>
     <w:p>
-      <w:pPr>
-        <w:spacing w:after="100"/>
-      </w:pPr>
       <w:r>
         <w:rPr>
           <w:b/>
-          <w:color w:val="0F766E"/>
-          <w:sz w:val="19"/>
+          <w:color w:val="07847E"/>
         </w:rPr>
         <w:t xml:space="preserve">PIPELINE CONTRACT  </w:t>
       </w:r>
       <w:r>
-        <w:rPr>
-          <w:color w:val="1F2937"/>
-          <w:sz w:val="19"/>
-        </w:rPr>
-        <w:t>Each stage receives a PipelineState plus SessionContext and returns the updated state. The same stage contract supports minimal, enriched and future workflows without changing InterpreterAgent.</w:t>
+        <w:t>Each stage receives PipelineState and SessionContext and returns updated state. SequentialPipeline awaits stages in order; configured workflows can evolve without rewriting InterpreterAgent.</w:t>
       </w:r>
     </w:p>
     <w:p>
@@ -840,40 +680,54 @@
     </w:p>
     <w:p>
       <w:r>
-        <w:t>The central v0.4 design rule is that framework extension should happen through registration and composition, not through edits to the API or orchestration core.</w:t>
+        <w:t>Extension happens through explicit registration and composition, preserving the generic API and orchestration core. Provider adapters can change behind capability contracts.</w:t>
       </w:r>
     </w:p>
     <w:tbl>
       <w:tblPr>
-        <w:tblStyle w:val="TableGrid"/>
         <w:tblW w:type="auto" w:w="0"/>
-        <w:jc w:val="center"/>
+        <w:tblLayout w:type="fixed"/>
         <w:tblLook w:firstColumn="1" w:firstRow="1" w:lastColumn="0" w:lastRow="0" w:noHBand="0" w:noVBand="1" w:val="04A0"/>
+        <w:tblBorders>
+          <w:top w:val="single" w:sz="4" w:color="D9D9D9"/>
+          <w:bottom w:val="single" w:sz="4" w:color="D9D9D9"/>
+          <w:left w:val="single" w:sz="4" w:color="D9D9D9"/>
+          <w:right w:val="single" w:sz="4" w:color="D9D9D9"/>
+          <w:insideH w:val="single" w:sz="4" w:color="D9D9D9"/>
+          <w:insideV w:val="single" w:sz="4" w:color="D9D9D9"/>
+        </w:tblBorders>
       </w:tblPr>
       <w:tblGrid>
-        <w:gridCol w:w="3360"/>
-        <w:gridCol w:w="3360"/>
-        <w:gridCol w:w="3360"/>
+        <w:gridCol w:w="2016"/>
+        <w:gridCol w:w="4392"/>
+        <w:gridCol w:w="3672"/>
       </w:tblGrid>
       <w:tr>
+        <w:trPr>
+          <w:cantSplit/>
+          <w:tblHeader/>
+        </w:trPr>
         <w:tc>
           <w:tcPr>
-            <w:tcW w:type="dxa" w:w="2232"/>
-            <w:shd w:fill="17324D"/>
+            <w:tcW w:type="dxa" w:w="2016"/>
             <w:vAlign w:val="center"/>
+            <w:shd w:fill="19364D"/>
             <w:tcMar>
-              <w:top w:w="70" w:type="dxa"/>
-              <w:start w:w="80" w:type="dxa"/>
-              <w:bottom w:w="70" w:type="dxa"/>
-              <w:end w:w="80" w:type="dxa"/>
+              <w:top w:w="80" w:type="dxa"/>
+              <w:bottom w:w="80" w:type="dxa"/>
+              <w:left w:w="80" w:type="dxa"/>
+              <w:right w:w="80" w:type="dxa"/>
             </w:tcMar>
           </w:tcPr>
           <w:p>
+            <w:pPr>
+              <w:spacing w:after="60" w:line="240" w:lineRule="auto"/>
+            </w:pPr>
             <w:r>
               <w:rPr>
                 <w:b/>
                 <w:color w:val="FFFFFF"/>
-                <w:sz w:val="16"/>
+                <w:sz w:val="18"/>
               </w:rPr>
               <w:t>Extension</w:t>
             </w:r>
@@ -881,22 +735,25 @@
         </w:tc>
         <w:tc>
           <w:tcPr>
-            <w:tcW w:type="dxa" w:w="3816"/>
-            <w:shd w:fill="17324D"/>
+            <w:tcW w:type="dxa" w:w="4392"/>
             <w:vAlign w:val="center"/>
+            <w:shd w:fill="19364D"/>
             <w:tcMar>
-              <w:top w:w="70" w:type="dxa"/>
-              <w:start w:w="80" w:type="dxa"/>
-              <w:bottom w:w="70" w:type="dxa"/>
-              <w:end w:w="80" w:type="dxa"/>
+              <w:top w:w="80" w:type="dxa"/>
+              <w:bottom w:w="80" w:type="dxa"/>
+              <w:left w:w="80" w:type="dxa"/>
+              <w:right w:w="80" w:type="dxa"/>
             </w:tcMar>
           </w:tcPr>
           <w:p>
+            <w:pPr>
+              <w:spacing w:after="60" w:line="240" w:lineRule="auto"/>
+            </w:pPr>
             <w:r>
               <w:rPr>
                 <w:b/>
                 <w:color w:val="FFFFFF"/>
-                <w:sz w:val="16"/>
+                <w:sz w:val="18"/>
               </w:rPr>
               <w:t>Required change</w:t>
             </w:r>
@@ -904,46 +761,56 @@
         </w:tc>
         <w:tc>
           <w:tcPr>
-            <w:tcW w:type="dxa" w:w="3312"/>
-            <w:shd w:fill="17324D"/>
+            <w:tcW w:type="dxa" w:w="3672"/>
             <w:vAlign w:val="center"/>
+            <w:shd w:fill="19364D"/>
             <w:tcMar>
-              <w:top w:w="70" w:type="dxa"/>
-              <w:start w:w="80" w:type="dxa"/>
-              <w:bottom w:w="70" w:type="dxa"/>
-              <w:end w:w="80" w:type="dxa"/>
+              <w:top w:w="80" w:type="dxa"/>
+              <w:bottom w:w="80" w:type="dxa"/>
+              <w:left w:w="80" w:type="dxa"/>
+              <w:right w:w="80" w:type="dxa"/>
             </w:tcMar>
           </w:tcPr>
           <w:p>
+            <w:pPr>
+              <w:spacing w:after="60" w:line="240" w:lineRule="auto"/>
+            </w:pPr>
             <w:r>
               <w:rPr>
                 <w:b/>
                 <w:color w:val="FFFFFF"/>
-                <w:sz w:val="16"/>
+                <w:sz w:val="18"/>
               </w:rPr>
-              <w:t>No required change</w:t>
+              <w:t>Boundary preserved</w:t>
             </w:r>
           </w:p>
         </w:tc>
       </w:tr>
       <w:tr>
+        <w:trPr>
+          <w:cantSplit/>
+        </w:trPr>
         <w:tc>
           <w:tcPr>
-            <w:tcW w:type="dxa" w:w="2232"/>
+            <w:tcW w:type="dxa" w:w="2016"/>
             <w:vAlign w:val="center"/>
+            <w:shd w:fill="FFFFFF"/>
             <w:tcMar>
-              <w:top w:w="70" w:type="dxa"/>
-              <w:start w:w="80" w:type="dxa"/>
-              <w:bottom w:w="70" w:type="dxa"/>
-              <w:end w:w="80" w:type="dxa"/>
+              <w:top w:w="80" w:type="dxa"/>
+              <w:bottom w:w="80" w:type="dxa"/>
+              <w:left w:w="80" w:type="dxa"/>
+              <w:right w:w="80" w:type="dxa"/>
             </w:tcMar>
           </w:tcPr>
           <w:p>
+            <w:pPr>
+              <w:spacing w:after="60" w:line="240" w:lineRule="auto"/>
+            </w:pPr>
             <w:r>
               <w:rPr>
                 <w:b w:val="0"/>
-                <w:color w:val="1F2937"/>
-                <w:sz w:val="16"/>
+                <w:color w:val="273444"/>
+                <w:sz w:val="18"/>
               </w:rPr>
               <w:t>New agent</w:t>
             </w:r>
@@ -951,68 +818,82 @@
         </w:tc>
         <w:tc>
           <w:tcPr>
-            <w:tcW w:type="dxa" w:w="3816"/>
+            <w:tcW w:type="dxa" w:w="4392"/>
             <w:vAlign w:val="center"/>
+            <w:shd w:fill="FFFFFF"/>
             <w:tcMar>
-              <w:top w:w="70" w:type="dxa"/>
-              <w:start w:w="80" w:type="dxa"/>
-              <w:bottom w:w="70" w:type="dxa"/>
-              <w:end w:w="80" w:type="dxa"/>
+              <w:top w:w="80" w:type="dxa"/>
+              <w:bottom w:w="80" w:type="dxa"/>
+              <w:left w:w="80" w:type="dxa"/>
+              <w:right w:w="80" w:type="dxa"/>
             </w:tcMar>
           </w:tcPr>
           <w:p>
+            <w:pPr>
+              <w:spacing w:after="60" w:line="240" w:lineRule="auto"/>
+            </w:pPr>
             <w:r>
               <w:rPr>
                 <w:b w:val="0"/>
-                <w:color w:val="1F2937"/>
-                <w:sz w:val="16"/>
+                <w:color w:val="273444"/>
+                <w:sz w:val="18"/>
               </w:rPr>
-              <w:t>Implement BaseAgent contract; register in AgentRegistry</w:t>
+              <w:t>BaseAgent + AgentRegistry</w:t>
             </w:r>
           </w:p>
         </w:tc>
         <w:tc>
           <w:tcPr>
-            <w:tcW w:type="dxa" w:w="3312"/>
+            <w:tcW w:type="dxa" w:w="3672"/>
             <w:vAlign w:val="center"/>
+            <w:shd w:fill="FFFFFF"/>
             <w:tcMar>
-              <w:top w:w="70" w:type="dxa"/>
-              <w:start w:w="80" w:type="dxa"/>
-              <w:bottom w:w="70" w:type="dxa"/>
-              <w:end w:w="80" w:type="dxa"/>
+              <w:top w:w="80" w:type="dxa"/>
+              <w:bottom w:w="80" w:type="dxa"/>
+              <w:left w:w="80" w:type="dxa"/>
+              <w:right w:w="80" w:type="dxa"/>
             </w:tcMar>
           </w:tcPr>
           <w:p>
+            <w:pPr>
+              <w:spacing w:after="60" w:line="240" w:lineRule="auto"/>
+            </w:pPr>
             <w:r>
               <w:rPr>
                 <w:b w:val="0"/>
-                <w:color w:val="1F2937"/>
-                <w:sz w:val="16"/>
+                <w:color w:val="273444"/>
+                <w:sz w:val="18"/>
               </w:rPr>
-              <w:t>Generic API, AgentOrchestrator</w:t>
+              <w:t>API / AgentOrchestrator</w:t>
             </w:r>
           </w:p>
         </w:tc>
       </w:tr>
       <w:tr>
+        <w:trPr>
+          <w:cantSplit/>
+        </w:trPr>
         <w:tc>
           <w:tcPr>
-            <w:tcW w:type="dxa" w:w="2232"/>
+            <w:tcW w:type="dxa" w:w="2016"/>
             <w:vAlign w:val="center"/>
-            <w:shd w:fill="F5F7FA"/>
+            <w:shd w:fill="F3F6F9"/>
             <w:tcMar>
-              <w:top w:w="70" w:type="dxa"/>
-              <w:start w:w="80" w:type="dxa"/>
-              <w:bottom w:w="70" w:type="dxa"/>
-              <w:end w:w="80" w:type="dxa"/>
+              <w:top w:w="80" w:type="dxa"/>
+              <w:bottom w:w="80" w:type="dxa"/>
+              <w:left w:w="80" w:type="dxa"/>
+              <w:right w:w="80" w:type="dxa"/>
             </w:tcMar>
           </w:tcPr>
           <w:p>
+            <w:pPr>
+              <w:spacing w:after="60" w:line="240" w:lineRule="auto"/>
+            </w:pPr>
             <w:r>
               <w:rPr>
                 <w:b w:val="0"/>
-                <w:color w:val="1F2937"/>
-                <w:sz w:val="16"/>
+                <w:color w:val="273444"/>
+                <w:sz w:val="18"/>
               </w:rPr>
               <w:t>New provider</w:t>
             </w:r>
@@ -1020,69 +901,82 @@
         </w:tc>
         <w:tc>
           <w:tcPr>
-            <w:tcW w:type="dxa" w:w="3816"/>
+            <w:tcW w:type="dxa" w:w="4392"/>
             <w:vAlign w:val="center"/>
-            <w:shd w:fill="F5F7FA"/>
+            <w:shd w:fill="F3F6F9"/>
             <w:tcMar>
-              <w:top w:w="70" w:type="dxa"/>
-              <w:start w:w="80" w:type="dxa"/>
-              <w:bottom w:w="70" w:type="dxa"/>
-              <w:end w:w="80" w:type="dxa"/>
+              <w:top w:w="80" w:type="dxa"/>
+              <w:bottom w:w="80" w:type="dxa"/>
+              <w:left w:w="80" w:type="dxa"/>
+              <w:right w:w="80" w:type="dxa"/>
             </w:tcMar>
           </w:tcPr>
           <w:p>
+            <w:pPr>
+              <w:spacing w:after="60" w:line="240" w:lineRule="auto"/>
+            </w:pPr>
             <w:r>
               <w:rPr>
                 <w:b w:val="0"/>
-                <w:color w:val="1F2937"/>
-                <w:sz w:val="16"/>
+                <w:color w:val="273444"/>
+                <w:sz w:val="18"/>
               </w:rPr>
-              <w:t>Implement capability contract; register by capability + name</w:t>
+              <w:t>Implement capability contract; register capability + name.</w:t>
             </w:r>
           </w:p>
         </w:tc>
         <w:tc>
           <w:tcPr>
-            <w:tcW w:type="dxa" w:w="3312"/>
+            <w:tcW w:type="dxa" w:w="3672"/>
             <w:vAlign w:val="center"/>
-            <w:shd w:fill="F5F7FA"/>
+            <w:shd w:fill="F3F6F9"/>
             <w:tcMar>
-              <w:top w:w="70" w:type="dxa"/>
-              <w:start w:w="80" w:type="dxa"/>
-              <w:bottom w:w="70" w:type="dxa"/>
-              <w:end w:w="80" w:type="dxa"/>
+              <w:top w:w="80" w:type="dxa"/>
+              <w:bottom w:w="80" w:type="dxa"/>
+              <w:left w:w="80" w:type="dxa"/>
+              <w:right w:w="80" w:type="dxa"/>
             </w:tcMar>
           </w:tcPr>
           <w:p>
+            <w:pPr>
+              <w:spacing w:after="60" w:line="240" w:lineRule="auto"/>
+            </w:pPr>
             <w:r>
               <w:rPr>
                 <w:b w:val="0"/>
-                <w:color w:val="1F2937"/>
-                <w:sz w:val="16"/>
+                <w:color w:val="273444"/>
+                <w:sz w:val="18"/>
               </w:rPr>
-              <w:t>Skill, Agent, API</w:t>
+              <w:t>Skill / Agent / API</w:t>
             </w:r>
           </w:p>
         </w:tc>
       </w:tr>
       <w:tr>
+        <w:trPr>
+          <w:cantSplit/>
+        </w:trPr>
         <w:tc>
           <w:tcPr>
-            <w:tcW w:type="dxa" w:w="2232"/>
+            <w:tcW w:type="dxa" w:w="2016"/>
             <w:vAlign w:val="center"/>
+            <w:shd w:fill="FFFFFF"/>
             <w:tcMar>
-              <w:top w:w="70" w:type="dxa"/>
-              <w:start w:w="80" w:type="dxa"/>
-              <w:bottom w:w="70" w:type="dxa"/>
-              <w:end w:w="80" w:type="dxa"/>
+              <w:top w:w="80" w:type="dxa"/>
+              <w:bottom w:w="80" w:type="dxa"/>
+              <w:left w:w="80" w:type="dxa"/>
+              <w:right w:w="80" w:type="dxa"/>
             </w:tcMar>
           </w:tcPr>
           <w:p>
+            <w:pPr>
+              <w:spacing w:after="60" w:line="240" w:lineRule="auto"/>
+            </w:pPr>
             <w:r>
               <w:rPr>
                 <w:b w:val="0"/>
-                <w:color w:val="1F2937"/>
-                <w:sz w:val="16"/>
+                <w:color w:val="273444"/>
+                <w:sz w:val="18"/>
               </w:rPr>
               <w:t>New pipeline</w:t>
             </w:r>
@@ -1090,68 +984,82 @@
         </w:tc>
         <w:tc>
           <w:tcPr>
-            <w:tcW w:type="dxa" w:w="3816"/>
+            <w:tcW w:type="dxa" w:w="4392"/>
             <w:vAlign w:val="center"/>
+            <w:shd w:fill="FFFFFF"/>
             <w:tcMar>
-              <w:top w:w="70" w:type="dxa"/>
-              <w:start w:w="80" w:type="dxa"/>
-              <w:bottom w:w="70" w:type="dxa"/>
-              <w:end w:w="80" w:type="dxa"/>
+              <w:top w:w="80" w:type="dxa"/>
+              <w:bottom w:w="80" w:type="dxa"/>
+              <w:left w:w="80" w:type="dxa"/>
+              <w:right w:w="80" w:type="dxa"/>
             </w:tcMar>
           </w:tcPr>
           <w:p>
+            <w:pPr>
+              <w:spacing w:after="60" w:line="240" w:lineRule="auto"/>
+            </w:pPr>
             <w:r>
               <w:rPr>
                 <w:b w:val="0"/>
-                <w:color w:val="1F2937"/>
-                <w:sz w:val="16"/>
+                <w:color w:val="273444"/>
+                <w:sz w:val="18"/>
               </w:rPr>
-              <w:t>Compose PipelineStage implementations; register by name</w:t>
+              <w:t>Compose stages and register its name.</w:t>
             </w:r>
           </w:p>
         </w:tc>
         <w:tc>
           <w:tcPr>
-            <w:tcW w:type="dxa" w:w="3312"/>
+            <w:tcW w:type="dxa" w:w="3672"/>
             <w:vAlign w:val="center"/>
+            <w:shd w:fill="FFFFFF"/>
             <w:tcMar>
-              <w:top w:w="70" w:type="dxa"/>
-              <w:start w:w="80" w:type="dxa"/>
-              <w:bottom w:w="70" w:type="dxa"/>
-              <w:end w:w="80" w:type="dxa"/>
+              <w:top w:w="80" w:type="dxa"/>
+              <w:bottom w:w="80" w:type="dxa"/>
+              <w:left w:w="80" w:type="dxa"/>
+              <w:right w:w="80" w:type="dxa"/>
             </w:tcMar>
           </w:tcPr>
           <w:p>
+            <w:pPr>
+              <w:spacing w:after="60" w:line="240" w:lineRule="auto"/>
+            </w:pPr>
             <w:r>
               <w:rPr>
                 <w:b w:val="0"/>
-                <w:color w:val="1F2937"/>
-                <w:sz w:val="16"/>
+                <w:color w:val="273444"/>
+                <w:sz w:val="18"/>
               </w:rPr>
-              <w:t>SequentialPipeline engine</w:t>
+              <w:t>SequentialPipeline</w:t>
             </w:r>
           </w:p>
         </w:tc>
       </w:tr>
       <w:tr>
+        <w:trPr>
+          <w:cantSplit/>
+        </w:trPr>
         <w:tc>
           <w:tcPr>
-            <w:tcW w:type="dxa" w:w="2232"/>
+            <w:tcW w:type="dxa" w:w="2016"/>
             <w:vAlign w:val="center"/>
-            <w:shd w:fill="F5F7FA"/>
+            <w:shd w:fill="F3F6F9"/>
             <w:tcMar>
-              <w:top w:w="70" w:type="dxa"/>
-              <w:start w:w="80" w:type="dxa"/>
-              <w:bottom w:w="70" w:type="dxa"/>
-              <w:end w:w="80" w:type="dxa"/>
+              <w:top w:w="80" w:type="dxa"/>
+              <w:bottom w:w="80" w:type="dxa"/>
+              <w:left w:w="80" w:type="dxa"/>
+              <w:right w:w="80" w:type="dxa"/>
             </w:tcMar>
           </w:tcPr>
           <w:p>
+            <w:pPr>
+              <w:spacing w:after="60" w:line="240" w:lineRule="auto"/>
+            </w:pPr>
             <w:r>
               <w:rPr>
                 <w:b w:val="0"/>
-                <w:color w:val="1F2937"/>
-                <w:sz w:val="16"/>
+                <w:color w:val="273444"/>
+                <w:sz w:val="18"/>
               </w:rPr>
               <w:t>New stage</w:t>
             </w:r>
@@ -1159,115 +1067,136 @@
         </w:tc>
         <w:tc>
           <w:tcPr>
-            <w:tcW w:type="dxa" w:w="3816"/>
+            <w:tcW w:type="dxa" w:w="4392"/>
             <w:vAlign w:val="center"/>
-            <w:shd w:fill="F5F7FA"/>
+            <w:shd w:fill="F3F6F9"/>
             <w:tcMar>
-              <w:top w:w="70" w:type="dxa"/>
-              <w:start w:w="80" w:type="dxa"/>
-              <w:bottom w:w="70" w:type="dxa"/>
-              <w:end w:w="80" w:type="dxa"/>
+              <w:top w:w="80" w:type="dxa"/>
+              <w:bottom w:w="80" w:type="dxa"/>
+              <w:left w:w="80" w:type="dxa"/>
+              <w:right w:w="80" w:type="dxa"/>
             </w:tcMar>
           </w:tcPr>
           <w:p>
+            <w:pPr>
+              <w:spacing w:after="60" w:line="240" w:lineRule="auto"/>
+            </w:pPr>
             <w:r>
               <w:rPr>
                 <w:b w:val="0"/>
-                <w:color w:val="1F2937"/>
-                <w:sz w:val="16"/>
+                <w:color w:val="273444"/>
+                <w:sz w:val="18"/>
               </w:rPr>
-              <w:t>Implement PipelineStage contract and add to a pipeline</w:t>
+              <w:t>PipelineStage</w:t>
             </w:r>
           </w:p>
         </w:tc>
         <w:tc>
           <w:tcPr>
-            <w:tcW w:type="dxa" w:w="3312"/>
+            <w:tcW w:type="dxa" w:w="3672"/>
             <w:vAlign w:val="center"/>
-            <w:shd w:fill="F5F7FA"/>
+            <w:shd w:fill="F3F6F9"/>
             <w:tcMar>
-              <w:top w:w="70" w:type="dxa"/>
-              <w:start w:w="80" w:type="dxa"/>
-              <w:bottom w:w="70" w:type="dxa"/>
-              <w:end w:w="80" w:type="dxa"/>
+              <w:top w:w="80" w:type="dxa"/>
+              <w:bottom w:w="80" w:type="dxa"/>
+              <w:left w:w="80" w:type="dxa"/>
+              <w:right w:w="80" w:type="dxa"/>
             </w:tcMar>
           </w:tcPr>
           <w:p>
+            <w:pPr>
+              <w:spacing w:after="60" w:line="240" w:lineRule="auto"/>
+            </w:pPr>
             <w:r>
               <w:rPr>
                 <w:b w:val="0"/>
-                <w:color w:val="1F2937"/>
-                <w:sz w:val="16"/>
+                <w:color w:val="273444"/>
+                <w:sz w:val="18"/>
               </w:rPr>
-              <w:t>InterpreterAgent, API</w:t>
+              <w:t>InterpreterAgent / API</w:t>
             </w:r>
           </w:p>
         </w:tc>
       </w:tr>
       <w:tr>
+        <w:trPr>
+          <w:cantSplit/>
+        </w:trPr>
         <w:tc>
           <w:tcPr>
-            <w:tcW w:type="dxa" w:w="2232"/>
+            <w:tcW w:type="dxa" w:w="2016"/>
             <w:vAlign w:val="center"/>
+            <w:shd w:fill="FFFFFF"/>
             <w:tcMar>
-              <w:top w:w="70" w:type="dxa"/>
-              <w:start w:w="80" w:type="dxa"/>
-              <w:bottom w:w="70" w:type="dxa"/>
-              <w:end w:w="80" w:type="dxa"/>
+              <w:top w:w="80" w:type="dxa"/>
+              <w:bottom w:w="80" w:type="dxa"/>
+              <w:left w:w="80" w:type="dxa"/>
+              <w:right w:w="80" w:type="dxa"/>
             </w:tcMar>
           </w:tcPr>
           <w:p>
+            <w:pPr>
+              <w:spacing w:after="60" w:line="240" w:lineRule="auto"/>
+            </w:pPr>
             <w:r>
               <w:rPr>
                 <w:b w:val="0"/>
-                <w:color w:val="1F2937"/>
-                <w:sz w:val="16"/>
+                <w:color w:val="273444"/>
+                <w:sz w:val="18"/>
               </w:rPr>
-              <w:t>New quality/context strategy</w:t>
+              <w:t>Context/quality strategy</w:t>
             </w:r>
           </w:p>
         </w:tc>
         <w:tc>
           <w:tcPr>
-            <w:tcW w:type="dxa" w:w="3816"/>
+            <w:tcW w:type="dxa" w:w="4392"/>
             <w:vAlign w:val="center"/>
+            <w:shd w:fill="FFFFFF"/>
             <w:tcMar>
-              <w:top w:w="70" w:type="dxa"/>
-              <w:start w:w="80" w:type="dxa"/>
-              <w:bottom w:w="70" w:type="dxa"/>
-              <w:end w:w="80" w:type="dxa"/>
+              <w:top w:w="80" w:type="dxa"/>
+              <w:bottom w:w="80" w:type="dxa"/>
+              <w:left w:w="80" w:type="dxa"/>
+              <w:right w:w="80" w:type="dxa"/>
             </w:tcMar>
           </w:tcPr>
           <w:p>
+            <w:pPr>
+              <w:spacing w:after="60" w:line="240" w:lineRule="auto"/>
+            </w:pPr>
             <w:r>
               <w:rPr>
                 <w:b w:val="0"/>
-                <w:color w:val="1F2937"/>
-                <w:sz w:val="16"/>
+                <w:color w:val="273444"/>
+                <w:sz w:val="18"/>
               </w:rPr>
-              <w:t>Provide another QualityProvider or ContextProvider</w:t>
+              <w:t>ContextProvider / QualityProvider</w:t>
             </w:r>
           </w:p>
         </w:tc>
         <w:tc>
           <w:tcPr>
-            <w:tcW w:type="dxa" w:w="3312"/>
+            <w:tcW w:type="dxa" w:w="3672"/>
             <w:vAlign w:val="center"/>
+            <w:shd w:fill="FFFFFF"/>
             <w:tcMar>
-              <w:top w:w="70" w:type="dxa"/>
-              <w:start w:w="80" w:type="dxa"/>
-              <w:bottom w:w="70" w:type="dxa"/>
-              <w:end w:w="80" w:type="dxa"/>
+              <w:top w:w="80" w:type="dxa"/>
+              <w:bottom w:w="80" w:type="dxa"/>
+              <w:left w:w="80" w:type="dxa"/>
+              <w:right w:w="80" w:type="dxa"/>
             </w:tcMar>
           </w:tcPr>
           <w:p>
+            <w:pPr>
+              <w:spacing w:after="60" w:line="240" w:lineRule="auto"/>
+            </w:pPr>
             <w:r>
               <w:rPr>
                 <w:b w:val="0"/>
-                <w:color w:val="1F2937"/>
-                <w:sz w:val="16"/>
+                <w:color w:val="273444"/>
+                <w:sz w:val="18"/>
               </w:rPr>
-              <w:t>Pipeline structure and response contract</w:t>
+              <w:t>Configured stage structure.</w:t>
             </w:r>
           </w:p>
         </w:tc>
@@ -1275,138 +1204,60 @@
     </w:tbl>
     <w:p>
       <w:pPr>
-        <w:pStyle w:val="Heading2"/>
+        <w:spacing w:after="0"/>
       </w:pPr>
-      <w:r>
-        <w:t>7. Context and Quality as first-class capabilities</w:t>
-      </w:r>
-    </w:p>
-    <w:p>
-      <w:r>
-        <w:t>Context and Quality are integrated into both text and audio interpreter pipelines. Their default implementations deliberately avoid additional LLM calls while keeping the same provider contracts that a future semantic implementation can use.</w:t>
-      </w:r>
-    </w:p>
-    <w:p>
-      <w:pPr>
-        <w:pStyle w:val="ListBullet"/>
-        <w:spacing w:after="60"/>
-      </w:pPr>
-      <w:r>
-        <w:t>Context — PassthroughContextProvider preserves source text and metadata while keeping the enrichment slot active.</w:t>
-      </w:r>
-    </w:p>
-    <w:p>
-      <w:pPr>
-        <w:pStyle w:val="ListBullet"/>
-        <w:spacing w:after="60"/>
-      </w:pPr>
-      <w:r>
-        <w:t>Quality — DeterministicQualityProvider performs structural validation and does not claim semantic translation evaluation.</w:t>
-      </w:r>
-    </w:p>
-    <w:p>
-      <w:pPr>
-        <w:pStyle w:val="ListBullet"/>
-        <w:spacing w:after="60"/>
-      </w:pPr>
-      <w:r>
-        <w:t>Translation input — TranslationStage prefers enriched_text when present while preserving source_text unchanged.</w:t>
-      </w:r>
-    </w:p>
-    <w:p>
-      <w:pPr>
-        <w:pStyle w:val="ListBullet"/>
-        <w:spacing w:after="60"/>
-      </w:pPr>
-      <w:r>
-        <w:t>Response — InterpreterAgent exposes accepted, score, issues and quality metadata. A rejected quality result is observable but is not a blocking policy in v0.4.</w:t>
-      </w:r>
-    </w:p>
-    <w:p>
-      <w:pPr>
-        <w:pStyle w:val="ListBullet"/>
-        <w:spacing w:after="60"/>
-      </w:pPr>
-      <w:r>
-        <w:t>Future option — a semantic LLM evaluator can replace the deterministic provider through configuration without changing stages or agents.</w:t>
-      </w:r>
-    </w:p>
-    <w:p>
-      <w:pPr>
-        <w:spacing w:after="100"/>
-      </w:pPr>
-      <w:r>
-        <w:rPr>
-          <w:b/>
-          <w:color w:val="0F766E"/>
-          <w:sz w:val="19"/>
-        </w:rPr>
-        <w:t xml:space="preserve">DEFAULT PROVIDERS  </w:t>
-      </w:r>
-      <w:r>
-        <w:rPr>
-          <w:color w:val="1F2937"/>
-          <w:sz w:val="19"/>
-        </w:rPr>
-        <w:t>translation/openai · speech/openai · speech_to_text/openai · context/passthrough · quality/deterministic</w:t>
-      </w:r>
     </w:p>
     <w:p>
       <w:pPr>
         <w:pStyle w:val="Heading2"/>
       </w:pPr>
       <w:r>
-        <w:t>8. Reliability and observability inheritance</w:t>
-      </w:r>
-    </w:p>
-    <w:p>
-      <w:r>
-        <w:t>The v0.4 framework reuses the reliability guarantees introduced in v0.3 rather than reimplementing them in pipeline stages.</w:t>
+        <w:t>7. Context and Quality as first class capabilities</w:t>
       </w:r>
     </w:p>
     <w:p>
       <w:pPr>
         <w:pStyle w:val="ListBullet"/>
-        <w:spacing w:after="60"/>
       </w:pPr>
       <w:r>
-        <w:t>Provider retries and timeout policy stay centralized and explicit.</w:t>
+        <w:t>PassthroughContextProvider preserves source text/metadata. TranslationStage prefers enriched_text when supplied and preserves source_text.</w:t>
       </w:r>
     </w:p>
     <w:p>
       <w:pPr>
         <w:pStyle w:val="ListBullet"/>
-        <w:spacing w:after="60"/>
       </w:pPr>
       <w:r>
-        <w:t>AgentOrchestrator preserves stable error codes, HTTP status metadata and cancellation propagation.</w:t>
+        <w:t>DeterministicQualityProvider evaluates structure, not semantic translation correctness. accepted, score, issues and quality metadata are returned; rejection does not create an implicit blocking policy.</w:t>
+      </w:r>
+    </w:p>
+    <w:p>
+      <w:r>
+        <w:br w:type="page"/>
+      </w:r>
+    </w:p>
+    <w:p>
+      <w:pPr>
+        <w:pStyle w:val="Heading1"/>
+      </w:pPr>
+      <w:r>
+        <w:t>8. Reliability and observability inheritance</w:t>
       </w:r>
     </w:p>
     <w:p>
       <w:pPr>
         <w:pStyle w:val="ListBullet"/>
-        <w:spacing w:after="60"/>
       </w:pPr>
       <w:r>
-        <w:t>ExecutionTrace records stage name, provider, duration, outcome and error information.</w:t>
+        <w:t>Provider retry/timeout policies remain centralized where supported. AgentOrchestrator normalizes failures and preserves cancellation.</w:t>
       </w:r>
     </w:p>
     <w:p>
       <w:pPr>
         <w:pStyle w:val="ListBullet"/>
-        <w:spacing w:after="60"/>
       </w:pPr>
       <w:r>
-        <w:t>Prometheus exposes agent duration, stage duration, execution counts and provider retries.</w:t>
-      </w:r>
-    </w:p>
-    <w:p>
-      <w:pPr>
-        <w:pStyle w:val="ListBullet"/>
-        <w:spacing w:after="60"/>
-      </w:pPr>
-      <w:r>
-        <w:t>Context and Quality stages participate in the same tracing and metrics model as STT, translation and speech.</w:t>
+        <w:t>ExecutionTrace records stage/provider duration, outcome and error information. Prometheus covers executions, stage timing and retries.</w:t>
       </w:r>
     </w:p>
     <w:p>
@@ -1424,731 +1275,604 @@
     </w:p>
     <w:p>
       <w:r>
-        <w:t>Prototype, orchestration, reliability and framework extensibility are now successive validated foundations. The next milestone moves from framework flexibility to sustainable product deployment.</w:t>
-      </w:r>
-    </w:p>
-    <w:p>
-      <w:pPr>
-        <w:spacing w:after="100"/>
-      </w:pPr>
-      <w:r>
-        <w:rPr>
-          <w:b/>
-          <w:color w:val="0F766E"/>
-          <w:sz w:val="19"/>
-        </w:rPr>
-        <w:t xml:space="preserve">REPOSITORY MILESTONE V0.4.0  </w:t>
-      </w:r>
-      <w:r>
-        <w:rPr>
-          <w:color w:val="1F2937"/>
-          <w:sz w:val="19"/>
-        </w:rPr>
-        <w:t>AgentRegistry, ProviderRegistry, PipelineRegistry, provider contracts, configurable pipelines, Context and Quality capabilities, composition tests and generic API behavior complete the Framework Next milestone.</w:t>
+        <w:t>Each milestone builds on the preceding architecture. The table records capability delivery, not an assertion that an unseen public Git tag exists. Future scope is preserved from the historical milestone.</w:t>
       </w:r>
     </w:p>
     <w:tbl>
       <w:tblPr>
-        <w:tblStyle w:val="TableGrid"/>
         <w:tblW w:type="auto" w:w="0"/>
-        <w:jc w:val="center"/>
+        <w:tblLayout w:type="fixed"/>
         <w:tblLook w:firstColumn="1" w:firstRow="1" w:lastColumn="0" w:lastRow="0" w:noHBand="0" w:noVBand="1" w:val="04A0"/>
+        <w:tblBorders>
+          <w:top w:val="single" w:sz="4" w:color="D9D9D9"/>
+          <w:bottom w:val="single" w:sz="4" w:color="D9D9D9"/>
+          <w:left w:val="single" w:sz="4" w:color="D9D9D9"/>
+          <w:right w:val="single" w:sz="4" w:color="D9D9D9"/>
+          <w:insideH w:val="single" w:sz="4" w:color="D9D9D9"/>
+          <w:insideV w:val="single" w:sz="4" w:color="D9D9D9"/>
+        </w:tblBorders>
       </w:tblPr>
       <w:tblGrid>
-        <w:gridCol w:w="2016"/>
-        <w:gridCol w:w="2016"/>
-        <w:gridCol w:w="2016"/>
-        <w:gridCol w:w="2016"/>
-        <w:gridCol w:w="2016"/>
+        <w:gridCol w:w="4608"/>
+        <w:gridCol w:w="5472"/>
       </w:tblGrid>
       <w:tr>
+        <w:trPr>
+          <w:cantSplit/>
+          <w:tblHeader/>
+        </w:trPr>
         <w:tc>
           <w:tcPr>
-            <w:tcW w:type="dxa" w:w="1440"/>
-            <w:shd w:fill="17324D"/>
+            <w:tcW w:type="dxa" w:w="4608"/>
             <w:vAlign w:val="center"/>
+            <w:shd w:fill="19364D"/>
             <w:tcMar>
-              <w:top w:w="70" w:type="dxa"/>
-              <w:start w:w="80" w:type="dxa"/>
-              <w:bottom w:w="70" w:type="dxa"/>
-              <w:end w:w="80" w:type="dxa"/>
+              <w:top w:w="80" w:type="dxa"/>
+              <w:bottom w:w="80" w:type="dxa"/>
+              <w:left w:w="80" w:type="dxa"/>
+              <w:right w:w="80" w:type="dxa"/>
             </w:tcMar>
           </w:tcPr>
           <w:p>
+            <w:pPr>
+              <w:spacing w:after="60" w:line="240" w:lineRule="auto"/>
+            </w:pPr>
             <w:r>
               <w:rPr>
                 <w:b/>
                 <w:color w:val="FFFFFF"/>
-                <w:sz w:val="14"/>
+                <w:sz w:val="18"/>
               </w:rPr>
-              <w:t>Stage</w:t>
+              <w:t>Milestone</w:t>
             </w:r>
           </w:p>
         </w:tc>
         <w:tc>
           <w:tcPr>
-            <w:tcW w:type="dxa" w:w="1037"/>
-            <w:shd w:fill="17324D"/>
+            <w:tcW w:type="dxa" w:w="5472"/>
             <w:vAlign w:val="center"/>
+            <w:shd w:fill="19364D"/>
             <w:tcMar>
-              <w:top w:w="70" w:type="dxa"/>
-              <w:start w:w="80" w:type="dxa"/>
-              <w:bottom w:w="70" w:type="dxa"/>
-              <w:end w:w="80" w:type="dxa"/>
+              <w:top w:w="80" w:type="dxa"/>
+              <w:bottom w:w="80" w:type="dxa"/>
+              <w:left w:w="80" w:type="dxa"/>
+              <w:right w:w="80" w:type="dxa"/>
             </w:tcMar>
           </w:tcPr>
           <w:p>
+            <w:pPr>
+              <w:spacing w:after="60" w:line="240" w:lineRule="auto"/>
+            </w:pPr>
             <w:r>
               <w:rPr>
                 <w:b/>
                 <w:color w:val="FFFFFF"/>
-                <w:sz w:val="14"/>
+                <w:sz w:val="18"/>
               </w:rPr>
-              <w:t>Status</w:t>
+              <w:t>Position in this edition</w:t>
+            </w:r>
+          </w:p>
+        </w:tc>
+      </w:tr>
+      <w:tr>
+        <w:trPr>
+          <w:cantSplit/>
+        </w:trPr>
+        <w:tc>
+          <w:tcPr>
+            <w:tcW w:type="dxa" w:w="4608"/>
+            <w:vAlign w:val="center"/>
+            <w:shd w:fill="FFFFFF"/>
+            <w:tcMar>
+              <w:top w:w="80" w:type="dxa"/>
+              <w:bottom w:w="80" w:type="dxa"/>
+              <w:left w:w="80" w:type="dxa"/>
+              <w:right w:w="80" w:type="dxa"/>
+            </w:tcMar>
+          </w:tcPr>
+          <w:p>
+            <w:pPr>
+              <w:spacing w:after="60" w:line="240" w:lineRule="auto"/>
+            </w:pPr>
+            <w:r>
+              <w:rPr>
+                <w:b w:val="0"/>
+                <w:color w:val="273444"/>
+                <w:sz w:val="18"/>
+              </w:rPr>
+              <w:t>Prototype and orchestration</w:t>
             </w:r>
           </w:p>
         </w:tc>
         <w:tc>
           <w:tcPr>
-            <w:tcW w:type="dxa" w:w="1800"/>
-            <w:shd w:fill="17324D"/>
+            <w:tcW w:type="dxa" w:w="5472"/>
             <w:vAlign w:val="center"/>
+            <w:shd w:fill="FFFFFF"/>
             <w:tcMar>
-              <w:top w:w="70" w:type="dxa"/>
-              <w:start w:w="80" w:type="dxa"/>
-              <w:bottom w:w="70" w:type="dxa"/>
-              <w:end w:w="80" w:type="dxa"/>
+              <w:top w:w="80" w:type="dxa"/>
+              <w:bottom w:w="80" w:type="dxa"/>
+              <w:left w:w="80" w:type="dxa"/>
+              <w:right w:w="80" w:type="dxa"/>
             </w:tcMar>
           </w:tcPr>
           <w:p>
+            <w:pPr>
+              <w:spacing w:after="60" w:line="240" w:lineRule="auto"/>
+            </w:pPr>
             <w:r>
               <w:rPr>
-                <w:b/>
-                <w:color w:val="FFFFFF"/>
-                <w:sz w:val="14"/>
+                <w:b w:val="0"/>
+                <w:color w:val="273444"/>
+                <w:sz w:val="18"/>
               </w:rPr>
-              <w:t>Objective</w:t>
+              <w:t>Foundation</w:t>
+            </w:r>
+          </w:p>
+        </w:tc>
+      </w:tr>
+      <w:tr>
+        <w:trPr>
+          <w:cantSplit/>
+        </w:trPr>
+        <w:tc>
+          <w:tcPr>
+            <w:tcW w:type="dxa" w:w="4608"/>
+            <w:vAlign w:val="center"/>
+            <w:shd w:fill="F3F6F9"/>
+            <w:tcMar>
+              <w:top w:w="80" w:type="dxa"/>
+              <w:bottom w:w="80" w:type="dxa"/>
+              <w:left w:w="80" w:type="dxa"/>
+              <w:right w:w="80" w:type="dxa"/>
+            </w:tcMar>
+          </w:tcPr>
+          <w:p>
+            <w:pPr>
+              <w:spacing w:after="60" w:line="240" w:lineRule="auto"/>
+            </w:pPr>
+            <w:r>
+              <w:rPr>
+                <w:b w:val="0"/>
+                <w:color w:val="273444"/>
+                <w:sz w:val="18"/>
+              </w:rPr>
+              <w:t>Reliability</w:t>
             </w:r>
           </w:p>
         </w:tc>
         <w:tc>
           <w:tcPr>
-            <w:tcW w:type="dxa" w:w="3096"/>
-            <w:shd w:fill="17324D"/>
+            <w:tcW w:type="dxa" w:w="5472"/>
             <w:vAlign w:val="center"/>
+            <w:shd w:fill="F3F6F9"/>
             <w:tcMar>
-              <w:top w:w="70" w:type="dxa"/>
-              <w:start w:w="80" w:type="dxa"/>
-              <w:bottom w:w="70" w:type="dxa"/>
-              <w:end w:w="80" w:type="dxa"/>
+              <w:top w:w="80" w:type="dxa"/>
+              <w:bottom w:w="80" w:type="dxa"/>
+              <w:left w:w="80" w:type="dxa"/>
+              <w:right w:w="80" w:type="dxa"/>
             </w:tcMar>
           </w:tcPr>
           <w:p>
+            <w:pPr>
+              <w:spacing w:after="60" w:line="240" w:lineRule="auto"/>
+            </w:pPr>
             <w:r>
               <w:rPr>
-                <w:b/>
-                <w:color w:val="FFFFFF"/>
-                <w:sz w:val="14"/>
+                <w:b w:val="0"/>
+                <w:color w:val="273444"/>
+                <w:sz w:val="18"/>
               </w:rPr>
-              <w:t>Technical deliverables</w:t>
+              <w:t>Foundation</w:t>
+            </w:r>
+          </w:p>
+        </w:tc>
+      </w:tr>
+      <w:tr>
+        <w:trPr>
+          <w:cantSplit/>
+        </w:trPr>
+        <w:tc>
+          <w:tcPr>
+            <w:tcW w:type="dxa" w:w="4608"/>
+            <w:vAlign w:val="center"/>
+            <w:shd w:fill="FFFFFF"/>
+            <w:tcMar>
+              <w:top w:w="80" w:type="dxa"/>
+              <w:bottom w:w="80" w:type="dxa"/>
+              <w:left w:w="80" w:type="dxa"/>
+              <w:right w:w="80" w:type="dxa"/>
+            </w:tcMar>
+          </w:tcPr>
+          <w:p>
+            <w:pPr>
+              <w:spacing w:after="60" w:line="240" w:lineRule="auto"/>
+            </w:pPr>
+            <w:r>
+              <w:rPr>
+                <w:b w:val="0"/>
+                <w:color w:val="273444"/>
+                <w:sz w:val="18"/>
+              </w:rPr>
+              <w:t>Framework Next</w:t>
             </w:r>
           </w:p>
         </w:tc>
         <w:tc>
           <w:tcPr>
-            <w:tcW w:type="dxa" w:w="2016"/>
-            <w:shd w:fill="17324D"/>
+            <w:tcW w:type="dxa" w:w="5472"/>
             <w:vAlign w:val="center"/>
+            <w:shd w:fill="FFFFFF"/>
             <w:tcMar>
-              <w:top w:w="70" w:type="dxa"/>
-              <w:start w:w="80" w:type="dxa"/>
-              <w:bottom w:w="70" w:type="dxa"/>
-              <w:end w:w="80" w:type="dxa"/>
+              <w:top w:w="80" w:type="dxa"/>
+              <w:bottom w:w="80" w:type="dxa"/>
+              <w:left w:w="80" w:type="dxa"/>
+              <w:right w:w="80" w:type="dxa"/>
             </w:tcMar>
           </w:tcPr>
           <w:p>
+            <w:pPr>
+              <w:spacing w:after="60" w:line="240" w:lineRule="auto"/>
+            </w:pPr>
             <w:r>
               <w:rPr>
-                <w:b/>
-                <w:color w:val="FFFFFF"/>
-                <w:sz w:val="14"/>
+                <w:b w:val="0"/>
+                <w:color w:val="273444"/>
+                <w:sz w:val="18"/>
               </w:rPr>
-              <w:t>Exit criterion</w:t>
+              <w:t>Milestone documented</w:t>
             </w:r>
           </w:p>
         </w:tc>
       </w:tr>
       <w:tr>
+        <w:trPr>
+          <w:cantSplit/>
+        </w:trPr>
         <w:tc>
           <w:tcPr>
-            <w:tcW w:type="dxa" w:w="1440"/>
+            <w:tcW w:type="dxa" w:w="4608"/>
             <w:vAlign w:val="center"/>
+            <w:shd w:fill="F3F6F9"/>
             <w:tcMar>
-              <w:top w:w="70" w:type="dxa"/>
-              <w:start w:w="80" w:type="dxa"/>
-              <w:bottom w:w="70" w:type="dxa"/>
-              <w:end w:w="80" w:type="dxa"/>
+              <w:top w:w="80" w:type="dxa"/>
+              <w:bottom w:w="80" w:type="dxa"/>
+              <w:left w:w="80" w:type="dxa"/>
+              <w:right w:w="80" w:type="dxa"/>
             </w:tcMar>
           </w:tcPr>
           <w:p>
+            <w:pPr>
+              <w:spacing w:after="60" w:line="240" w:lineRule="auto"/>
+            </w:pPr>
             <w:r>
               <w:rPr>
                 <w:b w:val="0"/>
-                <w:color w:val="1F2937"/>
-                <w:sz w:val="14"/>
+                <w:color w:val="273444"/>
+                <w:sz w:val="18"/>
               </w:rPr>
-              <w:t>0 · Prototype</w:t>
+              <w:t>Realtime Direct</w:t>
             </w:r>
           </w:p>
         </w:tc>
         <w:tc>
           <w:tcPr>
-            <w:tcW w:type="dxa" w:w="1037"/>
+            <w:tcW w:type="dxa" w:w="5472"/>
             <w:vAlign w:val="center"/>
+            <w:shd w:fill="F3F6F9"/>
             <w:tcMar>
-              <w:top w:w="70" w:type="dxa"/>
-              <w:start w:w="80" w:type="dxa"/>
-              <w:bottom w:w="70" w:type="dxa"/>
-              <w:end w:w="80" w:type="dxa"/>
+              <w:top w:w="80" w:type="dxa"/>
+              <w:bottom w:w="80" w:type="dxa"/>
+              <w:left w:w="80" w:type="dxa"/>
+              <w:right w:w="80" w:type="dxa"/>
             </w:tcMar>
           </w:tcPr>
           <w:p>
+            <w:pPr>
+              <w:spacing w:after="60" w:line="240" w:lineRule="auto"/>
+            </w:pPr>
             <w:r>
               <w:rPr>
-                <w:b/>
-                <w:color w:val="0F766E"/>
-                <w:sz w:val="14"/>
+                <w:b w:val="0"/>
+                <w:color w:val="273444"/>
+                <w:sz w:val="18"/>
               </w:rPr>
-              <w:t>Validated</w:t>
+              <w:t>Future at this version</w:t>
+            </w:r>
+          </w:p>
+        </w:tc>
+      </w:tr>
+      <w:tr>
+        <w:trPr>
+          <w:cantSplit/>
+        </w:trPr>
+        <w:tc>
+          <w:tcPr>
+            <w:tcW w:type="dxa" w:w="4608"/>
+            <w:vAlign w:val="center"/>
+            <w:shd w:fill="FFFFFF"/>
+            <w:tcMar>
+              <w:top w:w="80" w:type="dxa"/>
+              <w:bottom w:w="80" w:type="dxa"/>
+              <w:left w:w="80" w:type="dxa"/>
+              <w:right w:w="80" w:type="dxa"/>
+            </w:tcMar>
+          </w:tcPr>
+          <w:p>
+            <w:pPr>
+              <w:spacing w:after="60" w:line="240" w:lineRule="auto"/>
+            </w:pPr>
+            <w:r>
+              <w:rPr>
+                <w:b w:val="0"/>
+                <w:color w:val="273444"/>
+                <w:sz w:val="18"/>
+              </w:rPr>
+              <w:t>Realtime Enhanced</w:t>
             </w:r>
           </w:p>
         </w:tc>
         <w:tc>
           <w:tcPr>
-            <w:tcW w:type="dxa" w:w="1800"/>
+            <w:tcW w:type="dxa" w:w="5472"/>
             <w:vAlign w:val="center"/>
+            <w:shd w:fill="FFFFFF"/>
             <w:tcMar>
-              <w:top w:w="70" w:type="dxa"/>
-              <w:start w:w="80" w:type="dxa"/>
-              <w:bottom w:w="70" w:type="dxa"/>
-              <w:end w:w="80" w:type="dxa"/>
+              <w:top w:w="80" w:type="dxa"/>
+              <w:bottom w:w="80" w:type="dxa"/>
+              <w:left w:w="80" w:type="dxa"/>
+              <w:right w:w="80" w:type="dxa"/>
             </w:tcMar>
           </w:tcPr>
           <w:p>
+            <w:pPr>
+              <w:spacing w:after="60" w:line="240" w:lineRule="auto"/>
+            </w:pPr>
             <w:r>
               <w:rPr>
                 <w:b w:val="0"/>
-                <w:color w:val="1F2937"/>
-                <w:sz w:val="14"/>
+                <w:color w:val="273444"/>
+                <w:sz w:val="18"/>
               </w:rPr>
-              <w:t>Prove voice → translation → audio</w:t>
+              <w:t>Future at this version</w:t>
+            </w:r>
+          </w:p>
+        </w:tc>
+      </w:tr>
+      <w:tr>
+        <w:trPr>
+          <w:cantSplit/>
+        </w:trPr>
+        <w:tc>
+          <w:tcPr>
+            <w:tcW w:type="dxa" w:w="4608"/>
+            <w:vAlign w:val="center"/>
+            <w:shd w:fill="F3F6F9"/>
+            <w:tcMar>
+              <w:top w:w="80" w:type="dxa"/>
+              <w:bottom w:w="80" w:type="dxa"/>
+              <w:left w:w="80" w:type="dxa"/>
+              <w:right w:w="80" w:type="dxa"/>
+            </w:tcMar>
+          </w:tcPr>
+          <w:p>
+            <w:pPr>
+              <w:spacing w:after="60" w:line="240" w:lineRule="auto"/>
+            </w:pPr>
+            <w:r>
+              <w:rPr>
+                <w:b w:val="0"/>
+                <w:color w:val="273444"/>
+                <w:sz w:val="18"/>
+              </w:rPr>
+              <w:t>Universal Audio Output</w:t>
             </w:r>
           </w:p>
         </w:tc>
         <w:tc>
           <w:tcPr>
-            <w:tcW w:type="dxa" w:w="3096"/>
+            <w:tcW w:type="dxa" w:w="5472"/>
             <w:vAlign w:val="center"/>
+            <w:shd w:fill="F3F6F9"/>
             <w:tcMar>
-              <w:top w:w="70" w:type="dxa"/>
-              <w:start w:w="80" w:type="dxa"/>
-              <w:bottom w:w="70" w:type="dxa"/>
-              <w:end w:w="80" w:type="dxa"/>
+              <w:top w:w="80" w:type="dxa"/>
+              <w:bottom w:w="80" w:type="dxa"/>
+              <w:left w:w="80" w:type="dxa"/>
+              <w:right w:w="80" w:type="dxa"/>
             </w:tcMar>
           </w:tcPr>
           <w:p>
+            <w:pPr>
+              <w:spacing w:after="60" w:line="240" w:lineRule="auto"/>
+            </w:pPr>
             <w:r>
               <w:rPr>
                 <w:b w:val="0"/>
-                <w:color w:val="1F2937"/>
-                <w:sz w:val="14"/>
+                <w:color w:val="273444"/>
+                <w:sz w:val="18"/>
               </w:rPr>
-              <w:t>FastAPI, Streamlit, text/voice flows</w:t>
+              <w:t>Future at this version</w:t>
+            </w:r>
+          </w:p>
+        </w:tc>
+      </w:tr>
+      <w:tr>
+        <w:trPr>
+          <w:cantSplit/>
+        </w:trPr>
+        <w:tc>
+          <w:tcPr>
+            <w:tcW w:type="dxa" w:w="4608"/>
+            <w:vAlign w:val="center"/>
+            <w:shd w:fill="FFFFFF"/>
+            <w:tcMar>
+              <w:top w:w="80" w:type="dxa"/>
+              <w:bottom w:w="80" w:type="dxa"/>
+              <w:left w:w="80" w:type="dxa"/>
+              <w:right w:w="80" w:type="dxa"/>
+            </w:tcMar>
+          </w:tcPr>
+          <w:p>
+            <w:pPr>
+              <w:spacing w:after="60" w:line="240" w:lineRule="auto"/>
+            </w:pPr>
+            <w:r>
+              <w:rPr>
+                <w:b w:val="0"/>
+                <w:color w:val="273444"/>
+                <w:sz w:val="18"/>
+              </w:rPr>
+              <w:t>Device Control</w:t>
             </w:r>
           </w:p>
         </w:tc>
         <w:tc>
           <w:tcPr>
-            <w:tcW w:type="dxa" w:w="2016"/>
+            <w:tcW w:type="dxa" w:w="5472"/>
             <w:vAlign w:val="center"/>
+            <w:shd w:fill="FFFFFF"/>
             <w:tcMar>
-              <w:top w:w="70" w:type="dxa"/>
-              <w:start w:w="80" w:type="dxa"/>
-              <w:bottom w:w="70" w:type="dxa"/>
-              <w:end w:w="80" w:type="dxa"/>
+              <w:top w:w="80" w:type="dxa"/>
+              <w:bottom w:w="80" w:type="dxa"/>
+              <w:left w:w="80" w:type="dxa"/>
+              <w:right w:w="80" w:type="dxa"/>
             </w:tcMar>
           </w:tcPr>
           <w:p>
+            <w:pPr>
+              <w:spacing w:after="60" w:line="240" w:lineRule="auto"/>
+            </w:pPr>
             <w:r>
               <w:rPr>
                 <w:b w:val="0"/>
-                <w:color w:val="1F2937"/>
-                <w:sz w:val="14"/>
+                <w:color w:val="273444"/>
+                <w:sz w:val="18"/>
               </w:rPr>
-              <w:t>Functional journey demonstrated</w:t>
+              <w:t>Future at this version</w:t>
             </w:r>
           </w:p>
         </w:tc>
       </w:tr>
       <w:tr>
+        <w:trPr>
+          <w:cantSplit/>
+        </w:trPr>
         <w:tc>
           <w:tcPr>
-            <w:tcW w:type="dxa" w:w="1440"/>
+            <w:tcW w:type="dxa" w:w="4608"/>
             <w:vAlign w:val="center"/>
-            <w:shd w:fill="F5F7FA"/>
+            <w:shd w:fill="F3F6F9"/>
             <w:tcMar>
-              <w:top w:w="70" w:type="dxa"/>
-              <w:start w:w="80" w:type="dxa"/>
-              <w:bottom w:w="70" w:type="dxa"/>
-              <w:end w:w="80" w:type="dxa"/>
+              <w:top w:w="80" w:type="dxa"/>
+              <w:bottom w:w="80" w:type="dxa"/>
+              <w:left w:w="80" w:type="dxa"/>
+              <w:right w:w="80" w:type="dxa"/>
             </w:tcMar>
           </w:tcPr>
           <w:p>
+            <w:pPr>
+              <w:spacing w:after="60" w:line="240" w:lineRule="auto"/>
+            </w:pPr>
             <w:r>
               <w:rPr>
                 <w:b w:val="0"/>
-                <w:color w:val="1F2937"/>
-                <w:sz w:val="14"/>
+                <w:color w:val="273444"/>
+                <w:sz w:val="18"/>
               </w:rPr>
-              <w:t>1 · Orchestration</w:t>
+              <w:t>Product Readiness</w:t>
             </w:r>
           </w:p>
         </w:tc>
         <w:tc>
           <w:tcPr>
-            <w:tcW w:type="dxa" w:w="1037"/>
+            <w:tcW w:type="dxa" w:w="5472"/>
             <w:vAlign w:val="center"/>
-            <w:shd w:fill="F5F7FA"/>
+            <w:shd w:fill="F3F6F9"/>
             <w:tcMar>
-              <w:top w:w="70" w:type="dxa"/>
-              <w:start w:w="80" w:type="dxa"/>
-              <w:bottom w:w="70" w:type="dxa"/>
-              <w:end w:w="80" w:type="dxa"/>
+              <w:top w:w="80" w:type="dxa"/>
+              <w:bottom w:w="80" w:type="dxa"/>
+              <w:left w:w="80" w:type="dxa"/>
+              <w:right w:w="80" w:type="dxa"/>
             </w:tcMar>
           </w:tcPr>
           <w:p>
+            <w:pPr>
+              <w:spacing w:after="60" w:line="240" w:lineRule="auto"/>
+            </w:pPr>
             <w:r>
               <w:rPr>
-                <w:b/>
-                <w:color w:val="0F766E"/>
-                <w:sz w:val="14"/>
+                <w:b w:val="0"/>
+                <w:color w:val="273444"/>
+                <w:sz w:val="18"/>
               </w:rPr>
-              <w:t>Validated</w:t>
+              <w:t>Future at this version</w:t>
+            </w:r>
+          </w:p>
+        </w:tc>
+      </w:tr>
+      <w:tr>
+        <w:trPr>
+          <w:cantSplit/>
+        </w:trPr>
+        <w:tc>
+          <w:tcPr>
+            <w:tcW w:type="dxa" w:w="4608"/>
+            <w:vAlign w:val="center"/>
+            <w:shd w:fill="FFFFFF"/>
+            <w:tcMar>
+              <w:top w:w="80" w:type="dxa"/>
+              <w:bottom w:w="80" w:type="dxa"/>
+              <w:left w:w="80" w:type="dxa"/>
+              <w:right w:w="80" w:type="dxa"/>
+            </w:tcMar>
+          </w:tcPr>
+          <w:p>
+            <w:pPr>
+              <w:spacing w:after="60" w:line="240" w:lineRule="auto"/>
+            </w:pPr>
+            <w:r>
+              <w:rPr>
+                <w:b w:val="0"/>
+                <w:color w:val="273444"/>
+                <w:sz w:val="18"/>
+              </w:rPr>
+              <w:t>Stable Framework</w:t>
             </w:r>
           </w:p>
         </w:tc>
         <w:tc>
           <w:tcPr>
-            <w:tcW w:type="dxa" w:w="1800"/>
+            <w:tcW w:type="dxa" w:w="5472"/>
             <w:vAlign w:val="center"/>
-            <w:shd w:fill="F5F7FA"/>
+            <w:shd w:fill="FFFFFF"/>
             <w:tcMar>
-              <w:top w:w="70" w:type="dxa"/>
-              <w:start w:w="80" w:type="dxa"/>
-              <w:bottom w:w="70" w:type="dxa"/>
-              <w:end w:w="80" w:type="dxa"/>
+              <w:top w:w="80" w:type="dxa"/>
+              <w:bottom w:w="80" w:type="dxa"/>
+              <w:left w:w="80" w:type="dxa"/>
+              <w:right w:w="80" w:type="dxa"/>
             </w:tcMar>
           </w:tcPr>
           <w:p>
+            <w:pPr>
+              <w:spacing w:after="60" w:line="240" w:lineRule="auto"/>
+            </w:pPr>
             <w:r>
               <w:rPr>
                 <w:b w:val="0"/>
-                <w:color w:val="1F2937"/>
-                <w:sz w:val="14"/>
+                <w:color w:val="273444"/>
+                <w:sz w:val="18"/>
               </w:rPr>
-              <w:t>Unify execution behind agents</w:t>
-            </w:r>
-          </w:p>
-        </w:tc>
-        <w:tc>
-          <w:tcPr>
-            <w:tcW w:type="dxa" w:w="3096"/>
-            <w:vAlign w:val="center"/>
-            <w:shd w:fill="F5F7FA"/>
-            <w:tcMar>
-              <w:top w:w="70" w:type="dxa"/>
-              <w:start w:w="80" w:type="dxa"/>
-              <w:bottom w:w="70" w:type="dxa"/>
-              <w:end w:w="80" w:type="dxa"/>
-            </w:tcMar>
-          </w:tcPr>
-          <w:p>
-            <w:r>
-              <w:rPr>
-                <w:b w:val="0"/>
-                <w:color w:val="1F2937"/>
-                <w:sz w:val="14"/>
-              </w:rPr>
-              <w:t>Agent contracts, AgentOrchestrator, SessionContext</w:t>
-            </w:r>
-          </w:p>
-        </w:tc>
-        <w:tc>
-          <w:tcPr>
-            <w:tcW w:type="dxa" w:w="2016"/>
-            <w:vAlign w:val="center"/>
-            <w:shd w:fill="F5F7FA"/>
-            <w:tcMar>
-              <w:top w:w="70" w:type="dxa"/>
-              <w:start w:w="80" w:type="dxa"/>
-              <w:bottom w:w="70" w:type="dxa"/>
-              <w:end w:w="80" w:type="dxa"/>
-            </w:tcMar>
-          </w:tcPr>
-          <w:p>
-            <w:r>
-              <w:rPr>
-                <w:b w:val="0"/>
-                <w:color w:val="1F2937"/>
-                <w:sz w:val="14"/>
-              </w:rPr>
-              <w:t>One execution model for text and voice</w:t>
-            </w:r>
-          </w:p>
-        </w:tc>
-      </w:tr>
-      <w:tr>
-        <w:tc>
-          <w:tcPr>
-            <w:tcW w:type="dxa" w:w="1440"/>
-            <w:vAlign w:val="center"/>
-            <w:tcMar>
-              <w:top w:w="70" w:type="dxa"/>
-              <w:start w:w="80" w:type="dxa"/>
-              <w:bottom w:w="70" w:type="dxa"/>
-              <w:end w:w="80" w:type="dxa"/>
-            </w:tcMar>
-          </w:tcPr>
-          <w:p>
-            <w:r>
-              <w:rPr>
-                <w:b w:val="0"/>
-                <w:color w:val="1F2937"/>
-                <w:sz w:val="14"/>
-              </w:rPr>
-              <w:t>2 · Reliability</w:t>
-            </w:r>
-          </w:p>
-        </w:tc>
-        <w:tc>
-          <w:tcPr>
-            <w:tcW w:type="dxa" w:w="1037"/>
-            <w:vAlign w:val="center"/>
-            <w:tcMar>
-              <w:top w:w="70" w:type="dxa"/>
-              <w:start w:w="80" w:type="dxa"/>
-              <w:bottom w:w="70" w:type="dxa"/>
-              <w:end w:w="80" w:type="dxa"/>
-            </w:tcMar>
-          </w:tcPr>
-          <w:p>
-            <w:r>
-              <w:rPr>
-                <w:b/>
-                <w:color w:val="0F766E"/>
-                <w:sz w:val="14"/>
-              </w:rPr>
-              <w:t>Validated</w:t>
-            </w:r>
-          </w:p>
-        </w:tc>
-        <w:tc>
-          <w:tcPr>
-            <w:tcW w:type="dxa" w:w="1800"/>
-            <w:vAlign w:val="center"/>
-            <w:tcMar>
-              <w:top w:w="70" w:type="dxa"/>
-              <w:start w:w="80" w:type="dxa"/>
-              <w:bottom w:w="70" w:type="dxa"/>
-              <w:end w:w="80" w:type="dxa"/>
-            </w:tcMar>
-          </w:tcPr>
-          <w:p>
-            <w:r>
-              <w:rPr>
-                <w:b w:val="0"/>
-                <w:color w:val="1F2937"/>
-                <w:sz w:val="14"/>
-              </w:rPr>
-              <w:t>Make real-world use dependable</w:t>
-            </w:r>
-          </w:p>
-        </w:tc>
-        <w:tc>
-          <w:tcPr>
-            <w:tcW w:type="dxa" w:w="3096"/>
-            <w:vAlign w:val="center"/>
-            <w:tcMar>
-              <w:top w:w="70" w:type="dxa"/>
-              <w:start w:w="80" w:type="dxa"/>
-              <w:bottom w:w="70" w:type="dxa"/>
-              <w:end w:w="80" w:type="dxa"/>
-            </w:tcMar>
-          </w:tcPr>
-          <w:p>
-            <w:r>
-              <w:rPr>
-                <w:b w:val="0"/>
-                <w:color w:val="1F2937"/>
-                <w:sz w:val="14"/>
-              </w:rPr>
-              <w:t>Validation, async, retries/timeouts, tracing, metrics</w:t>
-            </w:r>
-          </w:p>
-        </w:tc>
-        <w:tc>
-          <w:tcPr>
-            <w:tcW w:type="dxa" w:w="2016"/>
-            <w:vAlign w:val="center"/>
-            <w:tcMar>
-              <w:top w:w="70" w:type="dxa"/>
-              <w:start w:w="80" w:type="dxa"/>
-              <w:bottom w:w="70" w:type="dxa"/>
-              <w:end w:w="80" w:type="dxa"/>
-            </w:tcMar>
-          </w:tcPr>
-          <w:p>
-            <w:r>
-              <w:rPr>
-                <w:b w:val="0"/>
-                <w:color w:val="1F2937"/>
-                <w:sz w:val="14"/>
-              </w:rPr>
-              <w:t>Controlled recovery and observable errors</w:t>
-            </w:r>
-          </w:p>
-        </w:tc>
-      </w:tr>
-      <w:tr>
-        <w:tc>
-          <w:tcPr>
-            <w:tcW w:type="dxa" w:w="1440"/>
-            <w:vAlign w:val="center"/>
-            <w:shd w:fill="F5F7FA"/>
-            <w:tcMar>
-              <w:top w:w="70" w:type="dxa"/>
-              <w:start w:w="80" w:type="dxa"/>
-              <w:bottom w:w="70" w:type="dxa"/>
-              <w:end w:w="80" w:type="dxa"/>
-            </w:tcMar>
-          </w:tcPr>
-          <w:p>
-            <w:r>
-              <w:rPr>
-                <w:b w:val="0"/>
-                <w:color w:val="1F2937"/>
-                <w:sz w:val="14"/>
-              </w:rPr>
-              <w:t>3 · Framework</w:t>
-            </w:r>
-          </w:p>
-        </w:tc>
-        <w:tc>
-          <w:tcPr>
-            <w:tcW w:type="dxa" w:w="1037"/>
-            <w:vAlign w:val="center"/>
-            <w:shd w:fill="F5F7FA"/>
-            <w:tcMar>
-              <w:top w:w="70" w:type="dxa"/>
-              <w:start w:w="80" w:type="dxa"/>
-              <w:bottom w:w="70" w:type="dxa"/>
-              <w:end w:w="80" w:type="dxa"/>
-            </w:tcMar>
-          </w:tcPr>
-          <w:p>
-            <w:r>
-              <w:rPr>
-                <w:b/>
-                <w:color w:val="0F766E"/>
-                <w:sz w:val="14"/>
-              </w:rPr>
-              <w:t>Current</w:t>
-            </w:r>
-          </w:p>
-        </w:tc>
-        <w:tc>
-          <w:tcPr>
-            <w:tcW w:type="dxa" w:w="1800"/>
-            <w:vAlign w:val="center"/>
-            <w:shd w:fill="F5F7FA"/>
-            <w:tcMar>
-              <w:top w:w="70" w:type="dxa"/>
-              <w:start w:w="80" w:type="dxa"/>
-              <w:bottom w:w="70" w:type="dxa"/>
-              <w:end w:w="80" w:type="dxa"/>
-            </w:tcMar>
-          </w:tcPr>
-          <w:p>
-            <w:r>
-              <w:rPr>
-                <w:b w:val="0"/>
-                <w:color w:val="1F2937"/>
-                <w:sz w:val="14"/>
-              </w:rPr>
-              <w:t>Make architecture extensible</w:t>
-            </w:r>
-          </w:p>
-        </w:tc>
-        <w:tc>
-          <w:tcPr>
-            <w:tcW w:type="dxa" w:w="3096"/>
-            <w:vAlign w:val="center"/>
-            <w:shd w:fill="F5F7FA"/>
-            <w:tcMar>
-              <w:top w:w="70" w:type="dxa"/>
-              <w:start w:w="80" w:type="dxa"/>
-              <w:bottom w:w="70" w:type="dxa"/>
-              <w:end w:w="80" w:type="dxa"/>
-            </w:tcMar>
-          </w:tcPr>
-          <w:p>
-            <w:r>
-              <w:rPr>
-                <w:b w:val="0"/>
-                <w:color w:val="1F2937"/>
-                <w:sz w:val="14"/>
-              </w:rPr>
-              <w:t>Registries, provider contracts, configurable pipelines, Context/Quality</w:t>
-            </w:r>
-          </w:p>
-        </w:tc>
-        <w:tc>
-          <w:tcPr>
-            <w:tcW w:type="dxa" w:w="2016"/>
-            <w:vAlign w:val="center"/>
-            <w:shd w:fill="F5F7FA"/>
-            <w:tcMar>
-              <w:top w:w="70" w:type="dxa"/>
-              <w:start w:w="80" w:type="dxa"/>
-              <w:bottom w:w="70" w:type="dxa"/>
-              <w:end w:w="80" w:type="dxa"/>
-            </w:tcMar>
-          </w:tcPr>
-          <w:p>
-            <w:r>
-              <w:rPr>
-                <w:b w:val="0"/>
-                <w:color w:val="1F2937"/>
-                <w:sz w:val="14"/>
-              </w:rPr>
-              <w:t>Add capabilities without changing API/orchestration core</w:t>
-            </w:r>
-          </w:p>
-        </w:tc>
-      </w:tr>
-      <w:tr>
-        <w:tc>
-          <w:tcPr>
-            <w:tcW w:type="dxa" w:w="1440"/>
-            <w:vAlign w:val="center"/>
-            <w:tcMar>
-              <w:top w:w="70" w:type="dxa"/>
-              <w:start w:w="80" w:type="dxa"/>
-              <w:bottom w:w="70" w:type="dxa"/>
-              <w:end w:w="80" w:type="dxa"/>
-            </w:tcMar>
-          </w:tcPr>
-          <w:p>
-            <w:r>
-              <w:rPr>
-                <w:b w:val="0"/>
-                <w:color w:val="1F2937"/>
-                <w:sz w:val="14"/>
-              </w:rPr>
-              <w:t>4 · Product</w:t>
-            </w:r>
-          </w:p>
-        </w:tc>
-        <w:tc>
-          <w:tcPr>
-            <w:tcW w:type="dxa" w:w="1037"/>
-            <w:vAlign w:val="center"/>
-            <w:tcMar>
-              <w:top w:w="70" w:type="dxa"/>
-              <w:start w:w="80" w:type="dxa"/>
-              <w:bottom w:w="70" w:type="dxa"/>
-              <w:end w:w="80" w:type="dxa"/>
-            </w:tcMar>
-          </w:tcPr>
-          <w:p>
-            <w:r>
-              <w:rPr>
-                <w:b/>
-                <w:color w:val="2E74B5"/>
-                <w:sz w:val="14"/>
-              </w:rPr>
-              <w:t>Next</w:t>
-            </w:r>
-          </w:p>
-        </w:tc>
-        <w:tc>
-          <w:tcPr>
-            <w:tcW w:type="dxa" w:w="1800"/>
-            <w:vAlign w:val="center"/>
-            <w:tcMar>
-              <w:top w:w="70" w:type="dxa"/>
-              <w:start w:w="80" w:type="dxa"/>
-              <w:bottom w:w="70" w:type="dxa"/>
-              <w:end w:w="80" w:type="dxa"/>
-            </w:tcMar>
-          </w:tcPr>
-          <w:p>
-            <w:r>
-              <w:rPr>
-                <w:b w:val="0"/>
-                <w:color w:val="1F2937"/>
-                <w:sz w:val="14"/>
-              </w:rPr>
-              <w:t>Prepare sustainable deployment</w:t>
-            </w:r>
-          </w:p>
-        </w:tc>
-        <w:tc>
-          <w:tcPr>
-            <w:tcW w:type="dxa" w:w="3096"/>
-            <w:vAlign w:val="center"/>
-            <w:tcMar>
-              <w:top w:w="70" w:type="dxa"/>
-              <w:start w:w="80" w:type="dxa"/>
-              <w:bottom w:w="70" w:type="dxa"/>
-              <w:end w:w="80" w:type="dxa"/>
-            </w:tcMar>
-          </w:tcPr>
-          <w:p>
-            <w:r>
-              <w:rPr>
-                <w:b w:val="0"/>
-                <w:color w:val="1F2937"/>
-                <w:sz w:val="14"/>
-              </w:rPr>
-              <w:t>Persistent sessions, security/privacy, CI/CD, packaging, production observability</w:t>
-            </w:r>
-          </w:p>
-        </w:tc>
-        <w:tc>
-          <w:tcPr>
-            <w:tcW w:type="dxa" w:w="2016"/>
-            <w:vAlign w:val="center"/>
-            <w:tcMar>
-              <w:top w:w="70" w:type="dxa"/>
-              <w:start w:w="80" w:type="dxa"/>
-              <w:bottom w:w="70" w:type="dxa"/>
-              <w:end w:w="80" w:type="dxa"/>
-            </w:tcMar>
-          </w:tcPr>
-          <w:p>
-            <w:r>
-              <w:rPr>
-                <w:b w:val="0"/>
-                <w:color w:val="1F2937"/>
-                <w:sz w:val="14"/>
-              </w:rPr>
-              <w:t>Deployable and governed version</w:t>
+              <w:t>Future at this version</w:t>
             </w:r>
           </w:p>
         </w:tc>
       </w:tr>
     </w:tbl>
+    <w:p>
+      <w:pPr>
+        <w:spacing w:after="0"/>
+      </w:pPr>
+    </w:p>
     <w:p>
       <w:pPr>
         <w:pStyle w:val="Heading2"/>
@@ -2159,105 +1883,105 @@
     </w:p>
     <w:tbl>
       <w:tblPr>
-        <w:tblStyle w:val="TableGrid"/>
         <w:tblW w:type="auto" w:w="0"/>
-        <w:jc w:val="center"/>
+        <w:tblLayout w:type="fixed"/>
         <w:tblLook w:firstColumn="1" w:firstRow="1" w:lastColumn="0" w:lastRow="0" w:noHBand="0" w:noVBand="1" w:val="04A0"/>
+        <w:tblBorders>
+          <w:top w:val="single" w:sz="4" w:color="D9D9D9"/>
+          <w:bottom w:val="single" w:sz="4" w:color="D9D9D9"/>
+          <w:left w:val="single" w:sz="4" w:color="D9D9D9"/>
+          <w:right w:val="single" w:sz="4" w:color="D9D9D9"/>
+          <w:insideH w:val="single" w:sz="4" w:color="D9D9D9"/>
+          <w:insideV w:val="single" w:sz="4" w:color="D9D9D9"/>
+        </w:tblBorders>
       </w:tblPr>
       <w:tblGrid>
-        <w:gridCol w:w="3360"/>
-        <w:gridCol w:w="3360"/>
-        <w:gridCol w:w="3360"/>
+        <w:gridCol w:w="2016"/>
+        <w:gridCol w:w="8064"/>
       </w:tblGrid>
       <w:tr>
+        <w:trPr>
+          <w:cantSplit/>
+          <w:tblHeader/>
+        </w:trPr>
         <w:tc>
           <w:tcPr>
-            <w:tcW w:type="dxa" w:w="1800"/>
-            <w:shd w:fill="17324D"/>
+            <w:tcW w:type="dxa" w:w="2016"/>
             <w:vAlign w:val="center"/>
+            <w:shd w:fill="19364D"/>
             <w:tcMar>
-              <w:top w:w="70" w:type="dxa"/>
-              <w:start w:w="80" w:type="dxa"/>
-              <w:bottom w:w="70" w:type="dxa"/>
-              <w:end w:w="80" w:type="dxa"/>
+              <w:top w:w="80" w:type="dxa"/>
+              <w:bottom w:w="80" w:type="dxa"/>
+              <w:left w:w="80" w:type="dxa"/>
+              <w:right w:w="80" w:type="dxa"/>
             </w:tcMar>
           </w:tcPr>
           <w:p>
+            <w:pPr>
+              <w:spacing w:after="60" w:line="240" w:lineRule="auto"/>
+            </w:pPr>
             <w:r>
               <w:rPr>
                 <w:b/>
                 <w:color w:val="FFFFFF"/>
-                <w:sz w:val="16"/>
+                <w:sz w:val="18"/>
               </w:rPr>
-              <w:t>Git tag</w:t>
+              <w:t>Version</w:t>
             </w:r>
           </w:p>
         </w:tc>
         <w:tc>
           <w:tcPr>
-            <w:tcW w:type="dxa" w:w="4896"/>
-            <w:shd w:fill="17324D"/>
+            <w:tcW w:type="dxa" w:w="8064"/>
             <w:vAlign w:val="center"/>
+            <w:shd w:fill="19364D"/>
             <w:tcMar>
-              <w:top w:w="70" w:type="dxa"/>
-              <w:start w:w="80" w:type="dxa"/>
-              <w:bottom w:w="70" w:type="dxa"/>
-              <w:end w:w="80" w:type="dxa"/>
+              <w:top w:w="80" w:type="dxa"/>
+              <w:bottom w:w="80" w:type="dxa"/>
+              <w:left w:w="80" w:type="dxa"/>
+              <w:right w:w="80" w:type="dxa"/>
             </w:tcMar>
           </w:tcPr>
           <w:p>
+            <w:pPr>
+              <w:spacing w:after="60" w:line="240" w:lineRule="auto"/>
+            </w:pPr>
             <w:r>
               <w:rPr>
                 <w:b/>
                 <w:color w:val="FFFFFF"/>
-                <w:sz w:val="16"/>
+                <w:sz w:val="18"/>
               </w:rPr>
               <w:t>Milestone</w:t>
             </w:r>
           </w:p>
         </w:tc>
+      </w:tr>
+      <w:tr>
+        <w:trPr>
+          <w:cantSplit/>
+        </w:trPr>
         <w:tc>
           <w:tcPr>
-            <w:tcW w:type="dxa" w:w="2304"/>
-            <w:shd w:fill="17324D"/>
+            <w:tcW w:type="dxa" w:w="2016"/>
             <w:vAlign w:val="center"/>
+            <w:shd w:fill="FFFFFF"/>
             <w:tcMar>
-              <w:top w:w="70" w:type="dxa"/>
-              <w:start w:w="80" w:type="dxa"/>
-              <w:bottom w:w="70" w:type="dxa"/>
-              <w:end w:w="80" w:type="dxa"/>
+              <w:top w:w="80" w:type="dxa"/>
+              <w:bottom w:w="80" w:type="dxa"/>
+              <w:left w:w="80" w:type="dxa"/>
+              <w:right w:w="80" w:type="dxa"/>
             </w:tcMar>
           </w:tcPr>
           <w:p>
-            <w:r>
-              <w:rPr>
-                <w:b/>
-                <w:color w:val="FFFFFF"/>
-                <w:sz w:val="16"/>
-              </w:rPr>
-              <w:t>Status</w:t>
-            </w:r>
-          </w:p>
-        </w:tc>
-      </w:tr>
-      <w:tr>
-        <w:tc>
-          <w:tcPr>
-            <w:tcW w:type="dxa" w:w="1800"/>
-            <w:vAlign w:val="center"/>
-            <w:tcMar>
-              <w:top w:w="70" w:type="dxa"/>
-              <w:start w:w="80" w:type="dxa"/>
-              <w:bottom w:w="70" w:type="dxa"/>
-              <w:end w:w="80" w:type="dxa"/>
-            </w:tcMar>
-          </w:tcPr>
-          <w:p>
+            <w:pPr>
+              <w:spacing w:after="60" w:line="240" w:lineRule="auto"/>
+            </w:pPr>
             <w:r>
               <w:rPr>
                 <w:b w:val="0"/>
-                <w:color w:val="1F2937"/>
-                <w:sz w:val="16"/>
+                <w:color w:val="273444"/>
+                <w:sz w:val="18"/>
               </w:rPr>
               <w:t>v0.1.0</w:t>
             </w:r>
@@ -2265,68 +1989,56 @@
         </w:tc>
         <w:tc>
           <w:tcPr>
-            <w:tcW w:type="dxa" w:w="4896"/>
+            <w:tcW w:type="dxa" w:w="8064"/>
             <w:vAlign w:val="center"/>
+            <w:shd w:fill="FFFFFF"/>
             <w:tcMar>
-              <w:top w:w="70" w:type="dxa"/>
-              <w:start w:w="80" w:type="dxa"/>
-              <w:bottom w:w="70" w:type="dxa"/>
-              <w:end w:w="80" w:type="dxa"/>
+              <w:top w:w="80" w:type="dxa"/>
+              <w:bottom w:w="80" w:type="dxa"/>
+              <w:left w:w="80" w:type="dxa"/>
+              <w:right w:w="80" w:type="dxa"/>
             </w:tcMar>
           </w:tcPr>
           <w:p>
+            <w:pPr>
+              <w:spacing w:after="60" w:line="240" w:lineRule="auto"/>
+            </w:pPr>
             <w:r>
               <w:rPr>
                 <w:b w:val="0"/>
-                <w:color w:val="1F2937"/>
-                <w:sz w:val="16"/>
+                <w:color w:val="273444"/>
+                <w:sz w:val="18"/>
               </w:rPr>
               <w:t>Prototype</w:t>
             </w:r>
           </w:p>
         </w:tc>
+      </w:tr>
+      <w:tr>
+        <w:trPr>
+          <w:cantSplit/>
+        </w:trPr>
         <w:tc>
           <w:tcPr>
-            <w:tcW w:type="dxa" w:w="2304"/>
+            <w:tcW w:type="dxa" w:w="2016"/>
             <w:vAlign w:val="center"/>
+            <w:shd w:fill="F3F6F9"/>
             <w:tcMar>
-              <w:top w:w="70" w:type="dxa"/>
-              <w:start w:w="80" w:type="dxa"/>
-              <w:bottom w:w="70" w:type="dxa"/>
-              <w:end w:w="80" w:type="dxa"/>
+              <w:top w:w="80" w:type="dxa"/>
+              <w:bottom w:w="80" w:type="dxa"/>
+              <w:left w:w="80" w:type="dxa"/>
+              <w:right w:w="80" w:type="dxa"/>
             </w:tcMar>
           </w:tcPr>
           <w:p>
+            <w:pPr>
+              <w:spacing w:after="60" w:line="240" w:lineRule="auto"/>
+            </w:pPr>
             <w:r>
               <w:rPr>
                 <w:b w:val="0"/>
-                <w:color w:val="1F2937"/>
-                <w:sz w:val="16"/>
-              </w:rPr>
-              <w:t>Released</w:t>
-            </w:r>
-          </w:p>
-        </w:tc>
-      </w:tr>
-      <w:tr>
-        <w:tc>
-          <w:tcPr>
-            <w:tcW w:type="dxa" w:w="1800"/>
-            <w:vAlign w:val="center"/>
-            <w:shd w:fill="F5F7FA"/>
-            <w:tcMar>
-              <w:top w:w="70" w:type="dxa"/>
-              <w:start w:w="80" w:type="dxa"/>
-              <w:bottom w:w="70" w:type="dxa"/>
-              <w:end w:w="80" w:type="dxa"/>
-            </w:tcMar>
-          </w:tcPr>
-          <w:p>
-            <w:r>
-              <w:rPr>
-                <w:b w:val="0"/>
-                <w:color w:val="1F2937"/>
-                <w:sz w:val="16"/>
+                <w:color w:val="273444"/>
+                <w:sz w:val="18"/>
               </w:rPr>
               <w:t>v0.2.0</w:t>
             </w:r>
@@ -2334,69 +2046,56 @@
         </w:tc>
         <w:tc>
           <w:tcPr>
-            <w:tcW w:type="dxa" w:w="4896"/>
+            <w:tcW w:type="dxa" w:w="8064"/>
             <w:vAlign w:val="center"/>
-            <w:shd w:fill="F5F7FA"/>
+            <w:shd w:fill="F3F6F9"/>
             <w:tcMar>
-              <w:top w:w="70" w:type="dxa"/>
-              <w:start w:w="80" w:type="dxa"/>
-              <w:bottom w:w="70" w:type="dxa"/>
-              <w:end w:w="80" w:type="dxa"/>
+              <w:top w:w="80" w:type="dxa"/>
+              <w:bottom w:w="80" w:type="dxa"/>
+              <w:left w:w="80" w:type="dxa"/>
+              <w:right w:w="80" w:type="dxa"/>
             </w:tcMar>
           </w:tcPr>
           <w:p>
+            <w:pPr>
+              <w:spacing w:after="60" w:line="240" w:lineRule="auto"/>
+            </w:pPr>
             <w:r>
               <w:rPr>
                 <w:b w:val="0"/>
-                <w:color w:val="1F2937"/>
-                <w:sz w:val="16"/>
+                <w:color w:val="273444"/>
+                <w:sz w:val="18"/>
               </w:rPr>
               <w:t>Agent Orchestration</w:t>
             </w:r>
           </w:p>
         </w:tc>
+      </w:tr>
+      <w:tr>
+        <w:trPr>
+          <w:cantSplit/>
+        </w:trPr>
         <w:tc>
           <w:tcPr>
-            <w:tcW w:type="dxa" w:w="2304"/>
+            <w:tcW w:type="dxa" w:w="2016"/>
             <w:vAlign w:val="center"/>
-            <w:shd w:fill="F5F7FA"/>
+            <w:shd w:fill="FFFFFF"/>
             <w:tcMar>
-              <w:top w:w="70" w:type="dxa"/>
-              <w:start w:w="80" w:type="dxa"/>
-              <w:bottom w:w="70" w:type="dxa"/>
-              <w:end w:w="80" w:type="dxa"/>
+              <w:top w:w="80" w:type="dxa"/>
+              <w:bottom w:w="80" w:type="dxa"/>
+              <w:left w:w="80" w:type="dxa"/>
+              <w:right w:w="80" w:type="dxa"/>
             </w:tcMar>
           </w:tcPr>
           <w:p>
+            <w:pPr>
+              <w:spacing w:after="60" w:line="240" w:lineRule="auto"/>
+            </w:pPr>
             <w:r>
               <w:rPr>
                 <w:b w:val="0"/>
-                <w:color w:val="1F2937"/>
-                <w:sz w:val="16"/>
-              </w:rPr>
-              <w:t>Released</w:t>
-            </w:r>
-          </w:p>
-        </w:tc>
-      </w:tr>
-      <w:tr>
-        <w:tc>
-          <w:tcPr>
-            <w:tcW w:type="dxa" w:w="1800"/>
-            <w:vAlign w:val="center"/>
-            <w:tcMar>
-              <w:top w:w="70" w:type="dxa"/>
-              <w:start w:w="80" w:type="dxa"/>
-              <w:bottom w:w="70" w:type="dxa"/>
-              <w:end w:w="80" w:type="dxa"/>
-            </w:tcMar>
-          </w:tcPr>
-          <w:p>
-            <w:r>
-              <w:rPr>
-                <w:b w:val="0"/>
-                <w:color w:val="1F2937"/>
-                <w:sz w:val="16"/>
+                <w:color w:val="273444"/>
+                <w:sz w:val="18"/>
               </w:rPr>
               <w:t>v0.3.0</w:t>
             </w:r>
@@ -2404,68 +2103,56 @@
         </w:tc>
         <w:tc>
           <w:tcPr>
-            <w:tcW w:type="dxa" w:w="4896"/>
+            <w:tcW w:type="dxa" w:w="8064"/>
             <w:vAlign w:val="center"/>
+            <w:shd w:fill="FFFFFF"/>
             <w:tcMar>
-              <w:top w:w="70" w:type="dxa"/>
-              <w:start w:w="80" w:type="dxa"/>
-              <w:bottom w:w="70" w:type="dxa"/>
-              <w:end w:w="80" w:type="dxa"/>
+              <w:top w:w="80" w:type="dxa"/>
+              <w:bottom w:w="80" w:type="dxa"/>
+              <w:left w:w="80" w:type="dxa"/>
+              <w:right w:w="80" w:type="dxa"/>
             </w:tcMar>
           </w:tcPr>
           <w:p>
+            <w:pPr>
+              <w:spacing w:after="60" w:line="240" w:lineRule="auto"/>
+            </w:pPr>
             <w:r>
               <w:rPr>
                 <w:b w:val="0"/>
-                <w:color w:val="1F2937"/>
-                <w:sz w:val="16"/>
+                <w:color w:val="273444"/>
+                <w:sz w:val="18"/>
               </w:rPr>
               <w:t>Reliability</w:t>
             </w:r>
           </w:p>
         </w:tc>
+      </w:tr>
+      <w:tr>
+        <w:trPr>
+          <w:cantSplit/>
+        </w:trPr>
         <w:tc>
           <w:tcPr>
-            <w:tcW w:type="dxa" w:w="2304"/>
+            <w:tcW w:type="dxa" w:w="2016"/>
             <w:vAlign w:val="center"/>
+            <w:shd w:fill="F3F6F9"/>
             <w:tcMar>
-              <w:top w:w="70" w:type="dxa"/>
-              <w:start w:w="80" w:type="dxa"/>
-              <w:bottom w:w="70" w:type="dxa"/>
-              <w:end w:w="80" w:type="dxa"/>
+              <w:top w:w="80" w:type="dxa"/>
+              <w:bottom w:w="80" w:type="dxa"/>
+              <w:left w:w="80" w:type="dxa"/>
+              <w:right w:w="80" w:type="dxa"/>
             </w:tcMar>
           </w:tcPr>
           <w:p>
+            <w:pPr>
+              <w:spacing w:after="60" w:line="240" w:lineRule="auto"/>
+            </w:pPr>
             <w:r>
               <w:rPr>
                 <w:b w:val="0"/>
-                <w:color w:val="1F2937"/>
-                <w:sz w:val="16"/>
-              </w:rPr>
-              <w:t>Released</w:t>
-            </w:r>
-          </w:p>
-        </w:tc>
-      </w:tr>
-      <w:tr>
-        <w:tc>
-          <w:tcPr>
-            <w:tcW w:type="dxa" w:w="1800"/>
-            <w:vAlign w:val="center"/>
-            <w:shd w:fill="F5F7FA"/>
-            <w:tcMar>
-              <w:top w:w="70" w:type="dxa"/>
-              <w:start w:w="80" w:type="dxa"/>
-              <w:bottom w:w="70" w:type="dxa"/>
-              <w:end w:w="80" w:type="dxa"/>
-            </w:tcMar>
-          </w:tcPr>
-          <w:p>
-            <w:r>
-              <w:rPr>
-                <w:b w:val="0"/>
-                <w:color w:val="1F2937"/>
-                <w:sz w:val="16"/>
+                <w:color w:val="273444"/>
+                <w:sz w:val="18"/>
               </w:rPr>
               <w:t>v0.4.0</w:t>
             </w:r>
@@ -2473,69 +2160,284 @@
         </w:tc>
         <w:tc>
           <w:tcPr>
-            <w:tcW w:type="dxa" w:w="4896"/>
+            <w:tcW w:type="dxa" w:w="8064"/>
             <w:vAlign w:val="center"/>
-            <w:shd w:fill="F5F7FA"/>
+            <w:shd w:fill="F3F6F9"/>
             <w:tcMar>
-              <w:top w:w="70" w:type="dxa"/>
-              <w:start w:w="80" w:type="dxa"/>
-              <w:bottom w:w="70" w:type="dxa"/>
-              <w:end w:w="80" w:type="dxa"/>
+              <w:top w:w="80" w:type="dxa"/>
+              <w:bottom w:w="80" w:type="dxa"/>
+              <w:left w:w="80" w:type="dxa"/>
+              <w:right w:w="80" w:type="dxa"/>
             </w:tcMar>
           </w:tcPr>
           <w:p>
+            <w:pPr>
+              <w:spacing w:after="60" w:line="240" w:lineRule="auto"/>
+            </w:pPr>
             <w:r>
               <w:rPr>
                 <w:b w:val="0"/>
-                <w:color w:val="1F2937"/>
-                <w:sz w:val="16"/>
+                <w:color w:val="273444"/>
+                <w:sz w:val="18"/>
               </w:rPr>
               <w:t>Framework Next</w:t>
             </w:r>
           </w:p>
         </w:tc>
+      </w:tr>
+      <w:tr>
+        <w:trPr>
+          <w:cantSplit/>
+        </w:trPr>
         <w:tc>
           <w:tcPr>
-            <w:tcW w:type="dxa" w:w="2304"/>
+            <w:tcW w:type="dxa" w:w="2016"/>
             <w:vAlign w:val="center"/>
-            <w:shd w:fill="F5F7FA"/>
+            <w:shd w:fill="FFFFFF"/>
             <w:tcMar>
-              <w:top w:w="70" w:type="dxa"/>
-              <w:start w:w="80" w:type="dxa"/>
-              <w:bottom w:w="70" w:type="dxa"/>
-              <w:end w:w="80" w:type="dxa"/>
+              <w:top w:w="80" w:type="dxa"/>
+              <w:bottom w:w="80" w:type="dxa"/>
+              <w:left w:w="80" w:type="dxa"/>
+              <w:right w:w="80" w:type="dxa"/>
             </w:tcMar>
           </w:tcPr>
           <w:p>
+            <w:pPr>
+              <w:spacing w:after="60" w:line="240" w:lineRule="auto"/>
+            </w:pPr>
             <w:r>
               <w:rPr>
                 <w:b w:val="0"/>
-                <w:color w:val="1F2937"/>
-                <w:sz w:val="16"/>
+                <w:color w:val="273444"/>
+                <w:sz w:val="18"/>
               </w:rPr>
-              <w:t>Current</w:t>
+              <w:t>v0.4.1</w:t>
+            </w:r>
+          </w:p>
+        </w:tc>
+        <w:tc>
+          <w:tcPr>
+            <w:tcW w:type="dxa" w:w="8064"/>
+            <w:vAlign w:val="center"/>
+            <w:shd w:fill="FFFFFF"/>
+            <w:tcMar>
+              <w:top w:w="80" w:type="dxa"/>
+              <w:bottom w:w="80" w:type="dxa"/>
+              <w:left w:w="80" w:type="dxa"/>
+              <w:right w:w="80" w:type="dxa"/>
+            </w:tcMar>
+          </w:tcPr>
+          <w:p>
+            <w:pPr>
+              <w:spacing w:after="60" w:line="240" w:lineRule="auto"/>
+            </w:pPr>
+            <w:r>
+              <w:rPr>
+                <w:b w:val="0"/>
+                <w:color w:val="273444"/>
+                <w:sz w:val="18"/>
+              </w:rPr>
+              <w:t>Realtime Translation and Voice Configuration</w:t>
             </w:r>
           </w:p>
         </w:tc>
       </w:tr>
       <w:tr>
+        <w:trPr>
+          <w:cantSplit/>
+        </w:trPr>
         <w:tc>
           <w:tcPr>
-            <w:tcW w:type="dxa" w:w="1800"/>
+            <w:tcW w:type="dxa" w:w="2016"/>
             <w:vAlign w:val="center"/>
+            <w:shd w:fill="F3F6F9"/>
             <w:tcMar>
-              <w:top w:w="70" w:type="dxa"/>
-              <w:start w:w="80" w:type="dxa"/>
-              <w:bottom w:w="70" w:type="dxa"/>
-              <w:end w:w="80" w:type="dxa"/>
+              <w:top w:w="80" w:type="dxa"/>
+              <w:bottom w:w="80" w:type="dxa"/>
+              <w:left w:w="80" w:type="dxa"/>
+              <w:right w:w="80" w:type="dxa"/>
             </w:tcMar>
           </w:tcPr>
           <w:p>
+            <w:pPr>
+              <w:spacing w:after="60" w:line="240" w:lineRule="auto"/>
+            </w:pPr>
             <w:r>
               <w:rPr>
                 <w:b w:val="0"/>
-                <w:color w:val="1F2937"/>
-                <w:sz w:val="16"/>
+                <w:color w:val="273444"/>
+                <w:sz w:val="18"/>
+              </w:rPr>
+              <w:t>v0.4.2</w:t>
+            </w:r>
+          </w:p>
+        </w:tc>
+        <w:tc>
+          <w:tcPr>
+            <w:tcW w:type="dxa" w:w="8064"/>
+            <w:vAlign w:val="center"/>
+            <w:shd w:fill="F3F6F9"/>
+            <w:tcMar>
+              <w:top w:w="80" w:type="dxa"/>
+              <w:bottom w:w="80" w:type="dxa"/>
+              <w:left w:w="80" w:type="dxa"/>
+              <w:right w:w="80" w:type="dxa"/>
+            </w:tcMar>
+          </w:tcPr>
+          <w:p>
+            <w:pPr>
+              <w:spacing w:after="60" w:line="240" w:lineRule="auto"/>
+            </w:pPr>
+            <w:r>
+              <w:rPr>
+                <w:b w:val="0"/>
+                <w:color w:val="273444"/>
+                <w:sz w:val="18"/>
+              </w:rPr>
+              <w:t>Realtime Enhanced Streaming</w:t>
+            </w:r>
+          </w:p>
+        </w:tc>
+      </w:tr>
+      <w:tr>
+        <w:trPr>
+          <w:cantSplit/>
+        </w:trPr>
+        <w:tc>
+          <w:tcPr>
+            <w:tcW w:type="dxa" w:w="2016"/>
+            <w:vAlign w:val="center"/>
+            <w:shd w:fill="FFFFFF"/>
+            <w:tcMar>
+              <w:top w:w="80" w:type="dxa"/>
+              <w:bottom w:w="80" w:type="dxa"/>
+              <w:left w:w="80" w:type="dxa"/>
+              <w:right w:w="80" w:type="dxa"/>
+            </w:tcMar>
+          </w:tcPr>
+          <w:p>
+            <w:pPr>
+              <w:spacing w:after="60" w:line="240" w:lineRule="auto"/>
+            </w:pPr>
+            <w:r>
+              <w:rPr>
+                <w:b w:val="0"/>
+                <w:color w:val="273444"/>
+                <w:sz w:val="18"/>
+              </w:rPr>
+              <w:t>v0.4.3</w:t>
+            </w:r>
+          </w:p>
+        </w:tc>
+        <w:tc>
+          <w:tcPr>
+            <w:tcW w:type="dxa" w:w="8064"/>
+            <w:vAlign w:val="center"/>
+            <w:shd w:fill="FFFFFF"/>
+            <w:tcMar>
+              <w:top w:w="80" w:type="dxa"/>
+              <w:bottom w:w="80" w:type="dxa"/>
+              <w:left w:w="80" w:type="dxa"/>
+              <w:right w:w="80" w:type="dxa"/>
+            </w:tcMar>
+          </w:tcPr>
+          <w:p>
+            <w:pPr>
+              <w:spacing w:after="60" w:line="240" w:lineRule="auto"/>
+            </w:pPr>
+            <w:r>
+              <w:rPr>
+                <w:b w:val="0"/>
+                <w:color w:val="273444"/>
+                <w:sz w:val="18"/>
+              </w:rPr>
+              <w:t>Universal Audio Output and Conferencing Bridge</w:t>
+            </w:r>
+          </w:p>
+        </w:tc>
+      </w:tr>
+      <w:tr>
+        <w:trPr>
+          <w:cantSplit/>
+        </w:trPr>
+        <w:tc>
+          <w:tcPr>
+            <w:tcW w:type="dxa" w:w="2016"/>
+            <w:vAlign w:val="center"/>
+            <w:shd w:fill="F3F6F9"/>
+            <w:tcMar>
+              <w:top w:w="80" w:type="dxa"/>
+              <w:bottom w:w="80" w:type="dxa"/>
+              <w:left w:w="80" w:type="dxa"/>
+              <w:right w:w="80" w:type="dxa"/>
+            </w:tcMar>
+          </w:tcPr>
+          <w:p>
+            <w:pPr>
+              <w:spacing w:after="60" w:line="240" w:lineRule="auto"/>
+            </w:pPr>
+            <w:r>
+              <w:rPr>
+                <w:b w:val="0"/>
+                <w:color w:val="273444"/>
+                <w:sz w:val="18"/>
+              </w:rPr>
+              <w:t>v0.4.4</w:t>
+            </w:r>
+          </w:p>
+        </w:tc>
+        <w:tc>
+          <w:tcPr>
+            <w:tcW w:type="dxa" w:w="8064"/>
+            <w:vAlign w:val="center"/>
+            <w:shd w:fill="F3F6F9"/>
+            <w:tcMar>
+              <w:top w:w="80" w:type="dxa"/>
+              <w:bottom w:w="80" w:type="dxa"/>
+              <w:left w:w="80" w:type="dxa"/>
+              <w:right w:w="80" w:type="dxa"/>
+            </w:tcMar>
+          </w:tcPr>
+          <w:p>
+            <w:pPr>
+              <w:spacing w:after="60" w:line="240" w:lineRule="auto"/>
+            </w:pPr>
+            <w:r>
+              <w:rPr>
+                <w:b w:val="0"/>
+                <w:color w:val="273444"/>
+                <w:sz w:val="18"/>
+              </w:rPr>
+              <w:t>Conferencing Audio and Device Control</w:t>
+            </w:r>
+          </w:p>
+        </w:tc>
+      </w:tr>
+      <w:tr>
+        <w:trPr>
+          <w:cantSplit/>
+        </w:trPr>
+        <w:tc>
+          <w:tcPr>
+            <w:tcW w:type="dxa" w:w="2016"/>
+            <w:vAlign w:val="center"/>
+            <w:shd w:fill="FFFFFF"/>
+            <w:tcMar>
+              <w:top w:w="80" w:type="dxa"/>
+              <w:bottom w:w="80" w:type="dxa"/>
+              <w:left w:w="80" w:type="dxa"/>
+              <w:right w:w="80" w:type="dxa"/>
+            </w:tcMar>
+          </w:tcPr>
+          <w:p>
+            <w:pPr>
+              <w:spacing w:after="60" w:line="240" w:lineRule="auto"/>
+            </w:pPr>
+            <w:r>
+              <w:rPr>
+                <w:b w:val="0"/>
+                <w:color w:val="273444"/>
+                <w:sz w:val="18"/>
               </w:rPr>
               <w:t>v0.5.0</w:t>
             </w:r>
@@ -2543,68 +2445,56 @@
         </w:tc>
         <w:tc>
           <w:tcPr>
-            <w:tcW w:type="dxa" w:w="4896"/>
+            <w:tcW w:type="dxa" w:w="8064"/>
             <w:vAlign w:val="center"/>
+            <w:shd w:fill="FFFFFF"/>
             <w:tcMar>
-              <w:top w:w="70" w:type="dxa"/>
-              <w:start w:w="80" w:type="dxa"/>
-              <w:bottom w:w="70" w:type="dxa"/>
-              <w:end w:w="80" w:type="dxa"/>
+              <w:top w:w="80" w:type="dxa"/>
+              <w:bottom w:w="80" w:type="dxa"/>
+              <w:left w:w="80" w:type="dxa"/>
+              <w:right w:w="80" w:type="dxa"/>
             </w:tcMar>
           </w:tcPr>
           <w:p>
+            <w:pPr>
+              <w:spacing w:after="60" w:line="240" w:lineRule="auto"/>
+            </w:pPr>
             <w:r>
               <w:rPr>
                 <w:b w:val="0"/>
-                <w:color w:val="1F2937"/>
-                <w:sz w:val="16"/>
+                <w:color w:val="273444"/>
+                <w:sz w:val="18"/>
               </w:rPr>
               <w:t>Product Readiness</w:t>
             </w:r>
           </w:p>
         </w:tc>
+      </w:tr>
+      <w:tr>
+        <w:trPr>
+          <w:cantSplit/>
+        </w:trPr>
         <w:tc>
           <w:tcPr>
-            <w:tcW w:type="dxa" w:w="2304"/>
+            <w:tcW w:type="dxa" w:w="2016"/>
             <w:vAlign w:val="center"/>
+            <w:shd w:fill="F3F6F9"/>
             <w:tcMar>
-              <w:top w:w="70" w:type="dxa"/>
-              <w:start w:w="80" w:type="dxa"/>
-              <w:bottom w:w="70" w:type="dxa"/>
-              <w:end w:w="80" w:type="dxa"/>
+              <w:top w:w="80" w:type="dxa"/>
+              <w:bottom w:w="80" w:type="dxa"/>
+              <w:left w:w="80" w:type="dxa"/>
+              <w:right w:w="80" w:type="dxa"/>
             </w:tcMar>
           </w:tcPr>
           <w:p>
+            <w:pPr>
+              <w:spacing w:after="60" w:line="240" w:lineRule="auto"/>
+            </w:pPr>
             <w:r>
               <w:rPr>
                 <w:b w:val="0"/>
-                <w:color w:val="1F2937"/>
-                <w:sz w:val="16"/>
-              </w:rPr>
-              <w:t>Next</w:t>
-            </w:r>
-          </w:p>
-        </w:tc>
-      </w:tr>
-      <w:tr>
-        <w:tc>
-          <w:tcPr>
-            <w:tcW w:type="dxa" w:w="1800"/>
-            <w:vAlign w:val="center"/>
-            <w:shd w:fill="F5F7FA"/>
-            <w:tcMar>
-              <w:top w:w="70" w:type="dxa"/>
-              <w:start w:w="80" w:type="dxa"/>
-              <w:bottom w:w="70" w:type="dxa"/>
-              <w:end w:w="80" w:type="dxa"/>
-            </w:tcMar>
-          </w:tcPr>
-          <w:p>
-            <w:r>
-              <w:rPr>
-                <w:b w:val="0"/>
-                <w:color w:val="1F2937"/>
-                <w:sz w:val="16"/>
+                <w:color w:val="273444"/>
+                <w:sz w:val="18"/>
               </w:rPr>
               <w:t>v1.0.0</w:t>
             </w:r>
@@ -2612,52 +2502,37 @@
         </w:tc>
         <w:tc>
           <w:tcPr>
-            <w:tcW w:type="dxa" w:w="4896"/>
+            <w:tcW w:type="dxa" w:w="8064"/>
             <w:vAlign w:val="center"/>
-            <w:shd w:fill="F5F7FA"/>
+            <w:shd w:fill="F3F6F9"/>
             <w:tcMar>
-              <w:top w:w="70" w:type="dxa"/>
-              <w:start w:w="80" w:type="dxa"/>
-              <w:bottom w:w="70" w:type="dxa"/>
-              <w:end w:w="80" w:type="dxa"/>
+              <w:top w:w="80" w:type="dxa"/>
+              <w:bottom w:w="80" w:type="dxa"/>
+              <w:left w:w="80" w:type="dxa"/>
+              <w:right w:w="80" w:type="dxa"/>
             </w:tcMar>
           </w:tcPr>
           <w:p>
+            <w:pPr>
+              <w:spacing w:after="60" w:line="240" w:lineRule="auto"/>
+            </w:pPr>
             <w:r>
               <w:rPr>
                 <w:b w:val="0"/>
-                <w:color w:val="1F2937"/>
-                <w:sz w:val="16"/>
+                <w:color w:val="273444"/>
+                <w:sz w:val="18"/>
               </w:rPr>
-              <w:t>Stable Framework</w:t>
-            </w:r>
-          </w:p>
-        </w:tc>
-        <w:tc>
-          <w:tcPr>
-            <w:tcW w:type="dxa" w:w="2304"/>
-            <w:vAlign w:val="center"/>
-            <w:shd w:fill="F5F7FA"/>
-            <w:tcMar>
-              <w:top w:w="70" w:type="dxa"/>
-              <w:start w:w="80" w:type="dxa"/>
-              <w:bottom w:w="70" w:type="dxa"/>
-              <w:end w:w="80" w:type="dxa"/>
-            </w:tcMar>
-          </w:tcPr>
-          <w:p>
-            <w:r>
-              <w:rPr>
-                <w:b w:val="0"/>
-                <w:color w:val="1F2937"/>
-                <w:sz w:val="16"/>
-              </w:rPr>
-              <w:t>Release target</w:t>
+              <w:t>Stable Framework Release</w:t>
             </w:r>
           </w:p>
         </w:tc>
       </w:tr>
     </w:tbl>
+    <w:p>
+      <w:pPr>
+        <w:spacing w:after="0"/>
+      </w:pPr>
+    </w:p>
     <w:p>
       <w:r>
         <w:br w:type="page"/>
@@ -2672,118 +2547,47 @@
       </w:r>
     </w:p>
     <w:p>
+      <w:pPr>
+        <w:pStyle w:val="ListBullet"/>
+      </w:pPr>
       <w:r>
-        <w:t>The Framework Next milestone is complete when the implementation proves that extension points are real architectural boundaries rather than naming conventions.</w:t>
+        <w:t>AgentRegistry, ProviderRegistry and PipelineRegistry make discovery and composition explicit.</w:t>
       </w:r>
     </w:p>
     <w:p>
       <w:pPr>
         <w:pStyle w:val="ListBullet"/>
-        <w:spacing w:after="60"/>
       </w:pPr>
       <w:r>
-        <w:t>Agents are discovered through AgentRegistry and executed through the generic API.</w:t>
+        <w:t>InterpreterAgent receives named text/audio pipelines. Context and Quality are agents, Skills, providers and pipeline stages.</w:t>
       </w:r>
     </w:p>
     <w:p>
       <w:pPr>
         <w:pStyle w:val="ListBullet"/>
-        <w:spacing w:after="60"/>
       </w:pPr>
       <w:r>
-        <w:t>Providers are selected through ProviderRegistry and interchangeable behind capability contracts.</w:t>
+        <w:t>This version does not deliver the later Direct/Enhanced paths, persistent owner isolation or production containers.</w:t>
       </w:r>
     </w:p>
     <w:p>
       <w:pPr>
         <w:pStyle w:val="ListBullet"/>
-        <w:spacing w:after="60"/>
       </w:pPr>
       <w:r>
-        <w:t>InterpreterAgent receives configured pipelines instead of directly coordinating provider-backed Skills.</w:t>
+        <w:t>Standard agents, provider selection and configured pipelines preserve the v0.4 extension boundaries and Context/Quality metadata.</w:t>
       </w:r>
     </w:p>
     <w:p>
-      <w:pPr>
-        <w:pStyle w:val="ListBullet"/>
-        <w:spacing w:after="60"/>
-      </w:pPr>
-      <w:r>
-        <w:t>Text and audio pipelines are assembled from reusable, ordered stages registered by name.</w:t>
-      </w:r>
-    </w:p>
-    <w:p>
-      <w:pPr>
-        <w:pStyle w:val="ListBullet"/>
-        <w:spacing w:after="60"/>
-      </w:pPr>
-      <w:r>
-        <w:t>Context and Quality are first-class agents, Skills, providers and pipeline stages.</w:t>
-      </w:r>
-    </w:p>
-    <w:p>
-      <w:pPr>
-        <w:pStyle w:val="ListBullet"/>
-        <w:spacing w:after="60"/>
-      </w:pPr>
-      <w:r>
-        <w:t>Default Context and Quality providers add no extra LLM call.</w:t>
-      </w:r>
-    </w:p>
-    <w:p>
-      <w:pPr>
-        <w:pStyle w:val="ListBullet"/>
-        <w:spacing w:after="60"/>
-      </w:pPr>
-      <w:r>
-        <w:t>Quality metadata is returned to callers without turning evaluation into an implicit blocking policy.</w:t>
-      </w:r>
-    </w:p>
-    <w:p>
-      <w:pPr>
-        <w:pStyle w:val="ListBullet"/>
-        <w:spacing w:after="60"/>
-      </w:pPr>
-      <w:r>
-        <w:t>Unknown providers and pipelines fail fast during composition.</w:t>
-      </w:r>
-    </w:p>
-    <w:p>
-      <w:pPr>
-        <w:pStyle w:val="ListBullet"/>
-        <w:spacing w:after="60"/>
-      </w:pPr>
-      <w:r>
-        <w:t>Automated tests cover unit behavior, composition, failure handling, provider interchangeability and pipeline execution.</w:t>
-      </w:r>
-    </w:p>
-    <w:p>
-      <w:pPr>
-        <w:pStyle w:val="ListBullet"/>
-        <w:spacing w:after="60"/>
-      </w:pPr>
-      <w:r>
-        <w:t>v0.3 reliability and observability guarantees remain intact.</w:t>
-      </w:r>
-    </w:p>
-    <w:p>
-      <w:pPr>
-        <w:spacing w:after="100"/>
-      </w:pPr>
       <w:r>
         <w:rPr>
           <w:b/>
-          <w:color w:val="0F766E"/>
-          <w:sz w:val="19"/>
+          <w:color w:val="07847E"/>
         </w:rPr>
-        <w:t xml:space="preserve">FRAMEWORK PRINCIPLE  </w:t>
+        <w:t xml:space="preserve">VALIDATION RECORD  </w:t>
       </w:r>
       <w:r>
-        <w:rPr>
-          <w:color w:val="1F2937"/>
-          <w:sz w:val="19"/>
-        </w:rPr>
-        <w:t>Add an agent, provider, or pipeline capability without changing the API or orchestration core.</w:t>
+        <w:t>Composition, unit, provider interchangeability, pipeline and generic API tests establish the architectural boundaries.</w:t>
       </w:r>
     </w:p>
     <w:p>
@@ -2791,86 +2595,37 @@
         <w:pStyle w:val="Heading2"/>
       </w:pPr>
       <w:r>
-        <w:t>12. Recommended next slice — Product Readiness</w:t>
+        <w:t>12. Recommended next slice</w:t>
       </w:r>
     </w:p>
     <w:p>
       <w:r>
-        <w:t>v0.5 should make the now-extensible framework deployable, governable and maintainable in long-running environments.</w:t>
+        <w:t>Product Readiness: persistent state, repeatable configuration, delivery gates, privacy and production observability.</w:t>
       </w:r>
     </w:p>
     <w:p>
       <w:pPr>
-        <w:pStyle w:val="ListBullet"/>
-        <w:spacing w:after="60"/>
+        <w:pStyle w:val="Heading2"/>
       </w:pPr>
       <w:r>
-        <w:t>Persist sessions and selected conversation state behind explicit retention rules.</w:t>
+        <w:t>Product readiness direction</w:t>
       </w:r>
     </w:p>
     <w:p>
-      <w:pPr>
-        <w:pStyle w:val="ListBullet"/>
-        <w:spacing w:after="60"/>
-      </w:pPr>
       <w:r>
-        <w:t>Add authentication, authorization and security boundaries suitable for public or shared deployments.</w:t>
+        <w:t>Persistent conversation state, privacy/security boundaries, repeatable settings/credentials, CI packaging and production signals remain the operational roadmap. Later implementation chooses client isolation, not implicit authentication; future roadmap aspirations are not delivered guarantees of this historical version.</w:t>
       </w:r>
     </w:p>
     <w:p>
-      <w:pPr>
-        <w:pStyle w:val="ListBullet"/>
-        <w:spacing w:after="60"/>
-      </w:pPr>
-      <w:r>
-        <w:t>Package configuration and provider credentials for repeatable environments.</w:t>
-      </w:r>
-    </w:p>
-    <w:p>
-      <w:pPr>
-        <w:pStyle w:val="ListBullet"/>
-        <w:spacing w:after="60"/>
-      </w:pPr>
-      <w:r>
-        <w:t>Add CI/CD quality gates, release automation and reproducible packaging.</w:t>
-      </w:r>
-    </w:p>
-    <w:p>
-      <w:pPr>
-        <w:pStyle w:val="ListBullet"/>
-        <w:spacing w:after="60"/>
-      </w:pPr>
-      <w:r>
-        <w:t>Extend production observability with operational dashboards, alerts and service-level signals.</w:t>
-      </w:r>
-    </w:p>
-    <w:p>
-      <w:pPr>
-        <w:pStyle w:val="ListBullet"/>
-        <w:spacing w:after="60"/>
-      </w:pPr>
-      <w:r>
-        <w:t>Document privacy, data lifecycle and provider-specific operational responsibilities.</w:t>
-      </w:r>
-    </w:p>
-    <w:p>
-      <w:pPr>
-        <w:spacing w:after="100"/>
-      </w:pPr>
       <w:r>
         <w:rPr>
           <w:b/>
-          <w:color w:val="0F766E"/>
-          <w:sz w:val="19"/>
+          <w:color w:val="07847E"/>
         </w:rPr>
-        <w:t xml:space="preserve">NEXT EXIT CRITERION  </w:t>
+        <w:t xml:space="preserve">FRAMEWORK PRINCIPLE  </w:t>
       </w:r>
       <w:r>
-        <w:rPr>
-          <w:color w:val="1F2937"/>
-          <w:sz w:val="19"/>
-        </w:rPr>
-        <w:t>A deployable and governed v0.5 package can run with persistent state, security controls, automated delivery and production-grade observability without weakening the v0.4 extension contracts.</w:t>
+        <w:t>Add a capability through registration and composition without moving provider-specific or conferencing concerns into generic API/orchestration.</w:t>
       </w:r>
     </w:p>
     <w:sectPr>
@@ -2938,8 +2693,8 @@
     <w:r>
       <w:rPr>
         <w:b/>
-        <w:color w:val="667085"/>
-        <w:sz w:val="17"/>
+        <w:color w:val="718096"/>
+        <w:sz w:val="16"/>
       </w:rPr>
       <w:t>WAAXALMA  ·  ARCHITECTURE &amp; VISION BOOK</w:t>
     </w:r>
@@ -3311,7 +3066,7 @@
     <w:qFormat/>
     <w:rsid w:val="00FC693F"/>
     <w:pPr>
-      <w:spacing w:after="100" w:line="259" w:lineRule="auto"/>
+      <w:spacing w:after="120" w:line="259" w:lineRule="auto"/>
     </w:pPr>
     <w:rPr>
       <w:rFonts w:ascii="Calibri" w:hAnsi="Calibri"/>
@@ -3660,18 +3415,15 @@
     <w:qFormat/>
     <w:rsid w:val="00FC693F"/>
     <w:pPr>
-      <w:pBdr>
-        <w:bottom w:val="single" w:sz="8" w:space="4" w:color="4F81BD" w:themeColor="accent1"/>
-      </w:pBdr>
       <w:spacing w:after="300" w:line="240" w:lineRule="auto"/>
       <w:contextualSpacing/>
     </w:pPr>
     <w:rPr>
       <w:rFonts w:asciiTheme="majorHAnsi" w:eastAsiaTheme="majorEastAsia" w:hAnsiTheme="majorHAnsi" w:cstheme="majorBidi"/>
-      <w:color w:val="17365D" w:themeColor="text2" w:themeShade="BF"/>
+      <w:color w:val="19364D"/>
       <w:spacing w:val="5"/>
       <w:kern w:val="28"/>
-      <w:sz w:val="52"/>
+      <w:sz w:val="56"/>
       <w:szCs w:val="52"/>
     </w:rPr>
   </w:style>
@@ -4152,9 +3904,6 @@
     <w:qFormat/>
     <w:rsid w:val="00FC693F"/>
     <w:pPr>
-      <w:pBdr>
-        <w:bottom w:val="single" w:sz="4" w:space="4" w:color="4F81BD" w:themeColor="accent1"/>
-      </w:pBdr>
       <w:spacing w:before="200" w:after="280"/>
       <w:ind w:left="936" w:right="936"/>
     </w:pPr>

</xml_diff>